<commit_message>
feat: complete time distribution logic and finalize variable renaming -Implement calcular_tiempos() and add re module in document.py. -Finish renaming duracion to duracion_total across routes.py and prompt.py. -Update sesion_template.docx to reflect new session parameters.
</commit_message>
<xml_diff>
--- a/src/ai_doc/templates/sesion_template.docx
+++ b/src/ai_doc/templates/sesion_template.docx
@@ -2224,14 +2224,14 @@
         <w:tblLook w:val="04A0" w:firstRow="1" w:lastRow="0" w:firstColumn="1" w:lastColumn="0" w:noHBand="0" w:noVBand="1"/>
       </w:tblPr>
       <w:tblGrid>
-        <w:gridCol w:w="2694"/>
-        <w:gridCol w:w="6379"/>
-        <w:gridCol w:w="1275"/>
+        <w:gridCol w:w="2450"/>
+        <w:gridCol w:w="4981"/>
+        <w:gridCol w:w="2917"/>
       </w:tblGrid>
       <w:tr>
         <w:tc>
           <w:tcPr>
-            <w:tcW w:w="2694" w:type="dxa"/>
+            <w:tcW w:w="2450" w:type="dxa"/>
             <w:shd w:val="clear" w:color="auto" w:fill="FFFFFF" w:themeFill="background1"/>
             <w:vAlign w:val="center"/>
           </w:tcPr>
@@ -2259,7 +2259,7 @@
         </w:tc>
         <w:tc>
           <w:tcPr>
-            <w:tcW w:w="6379" w:type="dxa"/>
+            <w:tcW w:w="4981" w:type="dxa"/>
             <w:shd w:val="clear" w:color="auto" w:fill="FFFFFF" w:themeFill="background1"/>
           </w:tcPr>
           <w:p>
@@ -2285,7 +2285,7 @@
         </w:tc>
         <w:tc>
           <w:tcPr>
-            <w:tcW w:w="1275" w:type="dxa"/>
+            <w:tcW w:w="2917" w:type="dxa"/>
             <w:shd w:val="clear" w:color="auto" w:fill="FFFFFF" w:themeFill="background1"/>
           </w:tcPr>
           <w:p>
@@ -2316,7 +2316,7 @@
         </w:trPr>
         <w:tc>
           <w:tcPr>
-            <w:tcW w:w="2694" w:type="dxa"/>
+            <w:tcW w:w="2450" w:type="dxa"/>
             <w:shd w:val="clear" w:color="auto" w:fill="FFFFFF" w:themeFill="background1"/>
             <w:vAlign w:val="center"/>
           </w:tcPr>
@@ -2344,7 +2344,7 @@
         </w:tc>
         <w:tc>
           <w:tcPr>
-            <w:tcW w:w="6379" w:type="dxa"/>
+            <w:tcW w:w="4981" w:type="dxa"/>
           </w:tcPr>
           <w:p>
             <w:pPr>
@@ -2395,7 +2395,7 @@
         </w:tc>
         <w:tc>
           <w:tcPr>
-            <w:tcW w:w="1275" w:type="dxa"/>
+            <w:tcW w:w="2917" w:type="dxa"/>
             <w:vAlign w:val="center"/>
           </w:tcPr>
           <w:p>
@@ -2408,6 +2408,50 @@
                 <w:szCs w:val="22"/>
               </w:rPr>
             </w:pPr>
+            <w:proofErr w:type="gramStart"/>
+            <w:r>
+              <w:rPr>
+                <w:rFonts w:eastAsia="Calibri"/>
+                <w:sz w:val="22"/>
+                <w:szCs w:val="22"/>
+              </w:rPr>
+              <w:t xml:space="preserve">{{ </w:t>
+            </w:r>
+            <w:proofErr w:type="spellStart"/>
+            <w:r>
+              <w:rPr>
+                <w:rFonts w:eastAsia="Calibri"/>
+                <w:sz w:val="22"/>
+                <w:szCs w:val="22"/>
+              </w:rPr>
+              <w:t>tiempo</w:t>
+            </w:r>
+            <w:proofErr w:type="gramEnd"/>
+            <w:r>
+              <w:rPr>
+                <w:rFonts w:eastAsia="Calibri"/>
+                <w:sz w:val="22"/>
+                <w:szCs w:val="22"/>
+              </w:rPr>
+              <w:t>_</w:t>
+            </w:r>
+            <w:r>
+              <w:rPr>
+                <w:rFonts w:eastAsia="Calibri"/>
+                <w:sz w:val="22"/>
+                <w:szCs w:val="22"/>
+              </w:rPr>
+              <w:t>proposito_aprendizaje</w:t>
+            </w:r>
+            <w:proofErr w:type="spellEnd"/>
+            <w:r>
+              <w:rPr>
+                <w:rFonts w:eastAsia="Calibri"/>
+                <w:sz w:val="22"/>
+                <w:szCs w:val="22"/>
+              </w:rPr>
+              <w:t xml:space="preserve"> }}</w:t>
+            </w:r>
           </w:p>
         </w:tc>
       </w:tr>
@@ -2417,7 +2461,7 @@
         </w:trPr>
         <w:tc>
           <w:tcPr>
-            <w:tcW w:w="2694" w:type="dxa"/>
+            <w:tcW w:w="2450" w:type="dxa"/>
             <w:shd w:val="clear" w:color="auto" w:fill="FFFFFF" w:themeFill="background1"/>
             <w:vAlign w:val="center"/>
           </w:tcPr>
@@ -2445,7 +2489,7 @@
         </w:tc>
         <w:tc>
           <w:tcPr>
-            <w:tcW w:w="6379" w:type="dxa"/>
+            <w:tcW w:w="4981" w:type="dxa"/>
           </w:tcPr>
           <w:p>
             <w:pPr>
@@ -2484,7 +2528,7 @@
         </w:tc>
         <w:tc>
           <w:tcPr>
-            <w:tcW w:w="1275" w:type="dxa"/>
+            <w:tcW w:w="2917" w:type="dxa"/>
             <w:vAlign w:val="center"/>
           </w:tcPr>
           <w:p>
@@ -2497,6 +2541,45 @@
                 <w:szCs w:val="22"/>
               </w:rPr>
             </w:pPr>
+            <w:proofErr w:type="gramStart"/>
+            <w:r>
+              <w:rPr>
+                <w:sz w:val="22"/>
+                <w:szCs w:val="22"/>
+              </w:rPr>
+              <w:t xml:space="preserve">{{ </w:t>
+            </w:r>
+            <w:proofErr w:type="spellStart"/>
+            <w:r>
+              <w:rPr>
+                <w:sz w:val="22"/>
+                <w:szCs w:val="22"/>
+              </w:rPr>
+              <w:t>tiempo</w:t>
+            </w:r>
+            <w:proofErr w:type="gramEnd"/>
+            <w:r>
+              <w:rPr>
+                <w:sz w:val="22"/>
+                <w:szCs w:val="22"/>
+              </w:rPr>
+              <w:t>_</w:t>
+            </w:r>
+            <w:r>
+              <w:rPr>
+                <w:sz w:val="22"/>
+                <w:szCs w:val="22"/>
+              </w:rPr>
+              <w:t>introduccion</w:t>
+            </w:r>
+            <w:proofErr w:type="spellEnd"/>
+            <w:r>
+              <w:rPr>
+                <w:sz w:val="22"/>
+                <w:szCs w:val="22"/>
+              </w:rPr>
+              <w:t xml:space="preserve"> }}</w:t>
+            </w:r>
           </w:p>
         </w:tc>
       </w:tr>
@@ -2506,7 +2589,7 @@
         </w:trPr>
         <w:tc>
           <w:tcPr>
-            <w:tcW w:w="2694" w:type="dxa"/>
+            <w:tcW w:w="2450" w:type="dxa"/>
             <w:shd w:val="clear" w:color="auto" w:fill="FFFFFF" w:themeFill="background1"/>
             <w:vAlign w:val="center"/>
           </w:tcPr>
@@ -2534,7 +2617,7 @@
         </w:tc>
         <w:tc>
           <w:tcPr>
-            <w:tcW w:w="6379" w:type="dxa"/>
+            <w:tcW w:w="4981" w:type="dxa"/>
           </w:tcPr>
           <w:p>
             <w:pPr>
@@ -2589,7 +2672,7 @@
         </w:tc>
         <w:tc>
           <w:tcPr>
-            <w:tcW w:w="1275" w:type="dxa"/>
+            <w:tcW w:w="2917" w:type="dxa"/>
             <w:vAlign w:val="center"/>
           </w:tcPr>
           <w:p>
@@ -2602,6 +2685,55 @@
                 <w:szCs w:val="22"/>
               </w:rPr>
             </w:pPr>
+            <w:proofErr w:type="gramStart"/>
+            <w:r>
+              <w:rPr>
+                <w:rFonts w:eastAsia="Arial"/>
+                <w:bCs/>
+                <w:sz w:val="22"/>
+                <w:szCs w:val="22"/>
+              </w:rPr>
+              <w:t xml:space="preserve">{{ </w:t>
+            </w:r>
+            <w:proofErr w:type="spellStart"/>
+            <w:r>
+              <w:rPr>
+                <w:rFonts w:eastAsia="Arial"/>
+                <w:bCs/>
+                <w:sz w:val="22"/>
+                <w:szCs w:val="22"/>
+              </w:rPr>
+              <w:t>tiempo</w:t>
+            </w:r>
+            <w:proofErr w:type="gramEnd"/>
+            <w:r>
+              <w:rPr>
+                <w:rFonts w:eastAsia="Arial"/>
+                <w:bCs/>
+                <w:sz w:val="22"/>
+                <w:szCs w:val="22"/>
+              </w:rPr>
+              <w:t>_</w:t>
+            </w:r>
+            <w:r>
+              <w:rPr>
+                <w:rFonts w:eastAsia="Arial"/>
+                <w:bCs/>
+                <w:sz w:val="22"/>
+                <w:szCs w:val="22"/>
+              </w:rPr>
+              <w:t>desarrollo_contenidos</w:t>
+            </w:r>
+            <w:proofErr w:type="spellEnd"/>
+            <w:r>
+              <w:rPr>
+                <w:rFonts w:eastAsia="Arial"/>
+                <w:bCs/>
+                <w:sz w:val="22"/>
+                <w:szCs w:val="22"/>
+              </w:rPr>
+              <w:t xml:space="preserve"> }}</w:t>
+            </w:r>
           </w:p>
         </w:tc>
       </w:tr>
@@ -2611,7 +2743,7 @@
         </w:trPr>
         <w:tc>
           <w:tcPr>
-            <w:tcW w:w="2694" w:type="dxa"/>
+            <w:tcW w:w="2450" w:type="dxa"/>
             <w:shd w:val="clear" w:color="auto" w:fill="FFFFFF" w:themeFill="background1"/>
             <w:vAlign w:val="center"/>
           </w:tcPr>
@@ -2639,7 +2771,7 @@
         </w:tc>
         <w:tc>
           <w:tcPr>
-            <w:tcW w:w="6379" w:type="dxa"/>
+            <w:tcW w:w="4981" w:type="dxa"/>
           </w:tcPr>
           <w:p>
             <w:pPr>
@@ -2694,7 +2826,7 @@
         </w:tc>
         <w:tc>
           <w:tcPr>
-            <w:tcW w:w="1275" w:type="dxa"/>
+            <w:tcW w:w="2917" w:type="dxa"/>
             <w:vAlign w:val="center"/>
           </w:tcPr>
           <w:p>
@@ -2707,6 +2839,55 @@
                 <w:szCs w:val="22"/>
               </w:rPr>
             </w:pPr>
+            <w:proofErr w:type="gramStart"/>
+            <w:r>
+              <w:rPr>
+                <w:rFonts w:eastAsia="Arial"/>
+                <w:bCs/>
+                <w:sz w:val="22"/>
+                <w:szCs w:val="22"/>
+              </w:rPr>
+              <w:t xml:space="preserve">{{ </w:t>
+            </w:r>
+            <w:proofErr w:type="spellStart"/>
+            <w:r>
+              <w:rPr>
+                <w:rFonts w:eastAsia="Arial"/>
+                <w:bCs/>
+                <w:sz w:val="22"/>
+                <w:szCs w:val="22"/>
+              </w:rPr>
+              <w:t>tiempo</w:t>
+            </w:r>
+            <w:proofErr w:type="gramEnd"/>
+            <w:r>
+              <w:rPr>
+                <w:rFonts w:eastAsia="Arial"/>
+                <w:bCs/>
+                <w:sz w:val="22"/>
+                <w:szCs w:val="22"/>
+              </w:rPr>
+              <w:t>_</w:t>
+            </w:r>
+            <w:r>
+              <w:rPr>
+                <w:rFonts w:eastAsia="Arial"/>
+                <w:bCs/>
+                <w:sz w:val="22"/>
+                <w:szCs w:val="22"/>
+              </w:rPr>
+              <w:t>desarrollo_actividades</w:t>
+            </w:r>
+            <w:proofErr w:type="spellEnd"/>
+            <w:r>
+              <w:rPr>
+                <w:rFonts w:eastAsia="Arial"/>
+                <w:bCs/>
+                <w:sz w:val="22"/>
+                <w:szCs w:val="22"/>
+              </w:rPr>
+              <w:t xml:space="preserve"> }}</w:t>
+            </w:r>
           </w:p>
         </w:tc>
       </w:tr>
@@ -2716,7 +2897,7 @@
         </w:trPr>
         <w:tc>
           <w:tcPr>
-            <w:tcW w:w="2694" w:type="dxa"/>
+            <w:tcW w:w="2450" w:type="dxa"/>
             <w:shd w:val="clear" w:color="auto" w:fill="FFFFFF" w:themeFill="background1"/>
             <w:vAlign w:val="center"/>
           </w:tcPr>
@@ -2744,7 +2925,7 @@
         </w:tc>
         <w:tc>
           <w:tcPr>
-            <w:tcW w:w="6379" w:type="dxa"/>
+            <w:tcW w:w="4981" w:type="dxa"/>
             <w:shd w:val="clear" w:color="auto" w:fill="FFFFFF" w:themeFill="background1"/>
           </w:tcPr>
           <w:p>
@@ -2798,7 +2979,7 @@
         </w:tc>
         <w:tc>
           <w:tcPr>
-            <w:tcW w:w="1275" w:type="dxa"/>
+            <w:tcW w:w="2917" w:type="dxa"/>
             <w:vAlign w:val="center"/>
           </w:tcPr>
           <w:p>
@@ -2811,6 +2992,50 @@
                 <w:szCs w:val="22"/>
               </w:rPr>
             </w:pPr>
+            <w:proofErr w:type="gramStart"/>
+            <w:r>
+              <w:rPr>
+                <w:rFonts w:eastAsia="Arial"/>
+                <w:sz w:val="22"/>
+                <w:szCs w:val="22"/>
+              </w:rPr>
+              <w:t xml:space="preserve">{{ </w:t>
+            </w:r>
+            <w:proofErr w:type="spellStart"/>
+            <w:r>
+              <w:rPr>
+                <w:rFonts w:eastAsia="Arial"/>
+                <w:sz w:val="22"/>
+                <w:szCs w:val="22"/>
+              </w:rPr>
+              <w:t>tiempo</w:t>
+            </w:r>
+            <w:proofErr w:type="gramEnd"/>
+            <w:r>
+              <w:rPr>
+                <w:rFonts w:eastAsia="Arial"/>
+                <w:sz w:val="22"/>
+                <w:szCs w:val="22"/>
+              </w:rPr>
+              <w:t>_</w:t>
+            </w:r>
+            <w:r>
+              <w:rPr>
+                <w:rFonts w:eastAsia="Arial"/>
+                <w:sz w:val="22"/>
+                <w:szCs w:val="22"/>
+              </w:rPr>
+              <w:t>evaluacion_formativa</w:t>
+            </w:r>
+            <w:proofErr w:type="spellEnd"/>
+            <w:r>
+              <w:rPr>
+                <w:rFonts w:eastAsia="Arial"/>
+                <w:sz w:val="22"/>
+                <w:szCs w:val="22"/>
+              </w:rPr>
+              <w:t xml:space="preserve"> }}</w:t>
+            </w:r>
           </w:p>
         </w:tc>
       </w:tr>
@@ -2820,7 +3045,7 @@
         </w:trPr>
         <w:tc>
           <w:tcPr>
-            <w:tcW w:w="2694" w:type="dxa"/>
+            <w:tcW w:w="2450" w:type="dxa"/>
             <w:shd w:val="clear" w:color="auto" w:fill="FFFFFF" w:themeFill="background1"/>
             <w:vAlign w:val="center"/>
           </w:tcPr>
@@ -2842,13 +3067,14 @@
                 <w:sz w:val="22"/>
                 <w:szCs w:val="22"/>
               </w:rPr>
+              <w:lastRenderedPageBreak/>
               <w:t>Retroalimentación (Transversal)</w:t>
             </w:r>
           </w:p>
         </w:tc>
         <w:tc>
           <w:tcPr>
-            <w:tcW w:w="6379" w:type="dxa"/>
+            <w:tcW w:w="4981" w:type="dxa"/>
           </w:tcPr>
           <w:p>
             <w:pPr>
@@ -2887,7 +3113,7 @@
         </w:tc>
         <w:tc>
           <w:tcPr>
-            <w:tcW w:w="1275" w:type="dxa"/>
+            <w:tcW w:w="2917" w:type="dxa"/>
             <w:vAlign w:val="center"/>
           </w:tcPr>
           <w:p>
@@ -2900,6 +3126,45 @@
                 <w:szCs w:val="22"/>
               </w:rPr>
             </w:pPr>
+            <w:proofErr w:type="gramStart"/>
+            <w:r>
+              <w:rPr>
+                <w:sz w:val="22"/>
+                <w:szCs w:val="22"/>
+              </w:rPr>
+              <w:t xml:space="preserve">{{ </w:t>
+            </w:r>
+            <w:proofErr w:type="spellStart"/>
+            <w:r>
+              <w:rPr>
+                <w:sz w:val="22"/>
+                <w:szCs w:val="22"/>
+              </w:rPr>
+              <w:t>tiempo</w:t>
+            </w:r>
+            <w:proofErr w:type="gramEnd"/>
+            <w:r>
+              <w:rPr>
+                <w:sz w:val="22"/>
+                <w:szCs w:val="22"/>
+              </w:rPr>
+              <w:t>_</w:t>
+            </w:r>
+            <w:r>
+              <w:rPr>
+                <w:sz w:val="22"/>
+                <w:szCs w:val="22"/>
+              </w:rPr>
+              <w:t>retroalimentacion</w:t>
+            </w:r>
+            <w:proofErr w:type="spellEnd"/>
+            <w:r>
+              <w:rPr>
+                <w:sz w:val="22"/>
+                <w:szCs w:val="22"/>
+              </w:rPr>
+              <w:t xml:space="preserve"> }}</w:t>
+            </w:r>
           </w:p>
         </w:tc>
       </w:tr>
@@ -2909,7 +3174,7 @@
         </w:trPr>
         <w:tc>
           <w:tcPr>
-            <w:tcW w:w="2694" w:type="dxa"/>
+            <w:tcW w:w="2450" w:type="dxa"/>
             <w:shd w:val="clear" w:color="auto" w:fill="FFFFFF" w:themeFill="background1"/>
             <w:vAlign w:val="center"/>
           </w:tcPr>
@@ -2931,14 +3196,13 @@
                 <w:sz w:val="22"/>
                 <w:szCs w:val="22"/>
               </w:rPr>
-              <w:lastRenderedPageBreak/>
               <w:t>Cierre</w:t>
             </w:r>
           </w:p>
         </w:tc>
         <w:tc>
           <w:tcPr>
-            <w:tcW w:w="6379" w:type="dxa"/>
+            <w:tcW w:w="4981" w:type="dxa"/>
           </w:tcPr>
           <w:p>
             <w:pPr>
@@ -2968,7 +3232,7 @@
         </w:tc>
         <w:tc>
           <w:tcPr>
-            <w:tcW w:w="1275" w:type="dxa"/>
+            <w:tcW w:w="2917" w:type="dxa"/>
             <w:vAlign w:val="center"/>
           </w:tcPr>
           <w:p>
@@ -2981,6 +3245,45 @@
                 <w:szCs w:val="22"/>
               </w:rPr>
             </w:pPr>
+            <w:proofErr w:type="gramStart"/>
+            <w:r>
+              <w:rPr>
+                <w:sz w:val="22"/>
+                <w:szCs w:val="22"/>
+              </w:rPr>
+              <w:t xml:space="preserve">{{ </w:t>
+            </w:r>
+            <w:proofErr w:type="spellStart"/>
+            <w:r>
+              <w:rPr>
+                <w:sz w:val="22"/>
+                <w:szCs w:val="22"/>
+              </w:rPr>
+              <w:t>tiempo</w:t>
+            </w:r>
+            <w:proofErr w:type="gramEnd"/>
+            <w:r>
+              <w:rPr>
+                <w:sz w:val="22"/>
+                <w:szCs w:val="22"/>
+              </w:rPr>
+              <w:t>_</w:t>
+            </w:r>
+            <w:r>
+              <w:rPr>
+                <w:sz w:val="22"/>
+                <w:szCs w:val="22"/>
+              </w:rPr>
+              <w:t>cierre</w:t>
+            </w:r>
+            <w:proofErr w:type="spellEnd"/>
+            <w:r>
+              <w:rPr>
+                <w:sz w:val="22"/>
+                <w:szCs w:val="22"/>
+              </w:rPr>
+              <w:t xml:space="preserve"> }}</w:t>
+            </w:r>
           </w:p>
         </w:tc>
       </w:tr>
@@ -2990,7 +3293,7 @@
         </w:trPr>
         <w:tc>
           <w:tcPr>
-            <w:tcW w:w="2694" w:type="dxa"/>
+            <w:tcW w:w="2450" w:type="dxa"/>
             <w:shd w:val="clear" w:color="auto" w:fill="FFFFFF" w:themeFill="background1"/>
             <w:vAlign w:val="center"/>
           </w:tcPr>
@@ -3019,7 +3322,7 @@
         </w:tc>
         <w:tc>
           <w:tcPr>
-            <w:tcW w:w="6379" w:type="dxa"/>
+            <w:tcW w:w="4981" w:type="dxa"/>
           </w:tcPr>
           <w:p>
             <w:pPr>
@@ -3066,9 +3369,179 @@
         </w:tc>
         <w:tc>
           <w:tcPr>
-            <w:tcW w:w="1275" w:type="dxa"/>
+            <w:tcW w:w="2917" w:type="dxa"/>
             <w:vAlign w:val="center"/>
           </w:tcPr>
+          <w:p>
+            <w:pPr>
+              <w:jc w:val="center"/>
+              <w:rPr>
+                <w:rFonts w:eastAsia="Arial"/>
+                <w:bCs/>
+                <w:sz w:val="22"/>
+                <w:szCs w:val="22"/>
+              </w:rPr>
+            </w:pPr>
+            <w:proofErr w:type="gramStart"/>
+            <w:r>
+              <w:rPr>
+                <w:rFonts w:eastAsia="Arial"/>
+                <w:bCs/>
+                <w:sz w:val="22"/>
+                <w:szCs w:val="22"/>
+              </w:rPr>
+              <w:t xml:space="preserve">{{ </w:t>
+            </w:r>
+            <w:proofErr w:type="spellStart"/>
+            <w:r>
+              <w:rPr>
+                <w:rFonts w:eastAsia="Arial"/>
+                <w:bCs/>
+                <w:sz w:val="22"/>
+                <w:szCs w:val="22"/>
+              </w:rPr>
+              <w:t>tiempo</w:t>
+            </w:r>
+            <w:proofErr w:type="gramEnd"/>
+            <w:r>
+              <w:rPr>
+                <w:rFonts w:eastAsia="Arial"/>
+                <w:bCs/>
+                <w:sz w:val="22"/>
+                <w:szCs w:val="22"/>
+              </w:rPr>
+              <w:t>_</w:t>
+            </w:r>
+            <w:r>
+              <w:rPr>
+                <w:rFonts w:eastAsia="Arial"/>
+                <w:bCs/>
+                <w:sz w:val="22"/>
+                <w:szCs w:val="22"/>
+              </w:rPr>
+              <w:t>extension</w:t>
+            </w:r>
+            <w:proofErr w:type="spellEnd"/>
+            <w:r>
+              <w:rPr>
+                <w:rFonts w:eastAsia="Arial"/>
+                <w:bCs/>
+                <w:sz w:val="22"/>
+                <w:szCs w:val="22"/>
+              </w:rPr>
+              <w:t xml:space="preserve"> }}</w:t>
+            </w:r>
+          </w:p>
+        </w:tc>
+      </w:tr>
+      <w:tr>
+        <w:trPr>
+          <w:trHeight w:val="448"/>
+        </w:trPr>
+        <w:tc>
+          <w:tcPr>
+            <w:tcW w:w="2450" w:type="dxa"/>
+            <w:shd w:val="clear" w:color="auto" w:fill="FFFFFF" w:themeFill="background1"/>
+            <w:vAlign w:val="center"/>
+          </w:tcPr>
+          <w:p>
+            <w:pPr>
+              <w:jc w:val="center"/>
+              <w:rPr>
+                <w:rFonts w:eastAsia="Arial"/>
+                <w:b/>
+                <w:bCs/>
+                <w:sz w:val="22"/>
+                <w:szCs w:val="22"/>
+              </w:rPr>
+            </w:pPr>
+          </w:p>
+        </w:tc>
+        <w:tc>
+          <w:tcPr>
+            <w:tcW w:w="4981" w:type="dxa"/>
+          </w:tcPr>
+          <w:p>
+            <w:pPr>
+              <w:jc w:val="both"/>
+              <w:rPr>
+                <w:rFonts w:eastAsia="Arial"/>
+                <w:bCs/>
+                <w:sz w:val="22"/>
+                <w:szCs w:val="22"/>
+              </w:rPr>
+            </w:pPr>
+          </w:p>
+        </w:tc>
+        <w:tc>
+          <w:tcPr>
+            <w:tcW w:w="2917" w:type="dxa"/>
+            <w:vAlign w:val="center"/>
+          </w:tcPr>
+          <w:p>
+            <w:pPr>
+              <w:jc w:val="center"/>
+              <w:rPr>
+                <w:rFonts w:eastAsia="Arial"/>
+                <w:sz w:val="22"/>
+                <w:szCs w:val="22"/>
+              </w:rPr>
+            </w:pPr>
+            <w:proofErr w:type="gramStart"/>
+            <w:r>
+              <w:rPr>
+                <w:rFonts w:eastAsia="Arial"/>
+                <w:sz w:val="22"/>
+                <w:szCs w:val="22"/>
+              </w:rPr>
+              <w:t xml:space="preserve">{{ </w:t>
+            </w:r>
+            <w:proofErr w:type="spellStart"/>
+            <w:r>
+              <w:rPr>
+                <w:rFonts w:eastAsia="Arial"/>
+                <w:sz w:val="22"/>
+                <w:szCs w:val="22"/>
+              </w:rPr>
+              <w:t>duracion</w:t>
+            </w:r>
+            <w:proofErr w:type="gramEnd"/>
+            <w:r>
+              <w:rPr>
+                <w:rFonts w:eastAsia="Arial"/>
+                <w:sz w:val="22"/>
+                <w:szCs w:val="22"/>
+              </w:rPr>
+              <w:t>_</w:t>
+            </w:r>
+            <w:proofErr w:type="gramStart"/>
+            <w:r>
+              <w:rPr>
+                <w:rFonts w:eastAsia="Arial"/>
+                <w:sz w:val="22"/>
+                <w:szCs w:val="22"/>
+              </w:rPr>
+              <w:t>total</w:t>
+            </w:r>
+            <w:proofErr w:type="spellEnd"/>
+            <w:r>
+              <w:rPr>
+                <w:rFonts w:eastAsia="Arial"/>
+                <w:sz w:val="22"/>
+                <w:szCs w:val="22"/>
+              </w:rPr>
+              <w:t xml:space="preserve"> }</w:t>
+            </w:r>
+            <w:proofErr w:type="gramEnd"/>
+            <w:r>
+              <w:rPr>
+                <w:rFonts w:eastAsia="Arial"/>
+                <w:sz w:val="22"/>
+                <w:szCs w:val="22"/>
+              </w:rPr>
+              <w:t>}</w:t>
+            </w:r>
+          </w:p>
           <w:p>
             <w:pPr>
               <w:jc w:val="center"/>
@@ -3220,43 +3693,6 @@
           <w:lang w:val="en-GB"/>
         </w:rPr>
       </w:pPr>
-    </w:p>
-    <w:p>
-      <w:pPr>
-        <w:rPr>
-          <w:rFonts w:eastAsia="Arial"/>
-          <w:sz w:val="22"/>
-          <w:szCs w:val="22"/>
-        </w:rPr>
-      </w:pPr>
-      <w:proofErr w:type="gramStart"/>
-      <w:r>
-        <w:rPr>
-          <w:rFonts w:eastAsia="Arial"/>
-          <w:sz w:val="22"/>
-          <w:szCs w:val="22"/>
-        </w:rPr>
-        <w:t xml:space="preserve">{{ </w:t>
-      </w:r>
-      <w:proofErr w:type="spellStart"/>
-      <w:r>
-        <w:rPr>
-          <w:rFonts w:eastAsia="Arial"/>
-          <w:sz w:val="22"/>
-          <w:szCs w:val="22"/>
-        </w:rPr>
-        <w:t>duracion</w:t>
-      </w:r>
-      <w:proofErr w:type="spellEnd"/>
-      <w:proofErr w:type="gramEnd"/>
-      <w:r>
-        <w:rPr>
-          <w:rFonts w:eastAsia="Arial"/>
-          <w:sz w:val="22"/>
-          <w:szCs w:val="22"/>
-        </w:rPr>
-        <w:t xml:space="preserve"> }}</w:t>
-      </w:r>
     </w:p>
     <w:p>
       <w:pPr>
@@ -4104,13 +4540,59 @@
                 <w:szCs w:val="22"/>
               </w:rPr>
             </w:pPr>
+            <w:proofErr w:type="gramStart"/>
             <w:r>
               <w:rPr>
                 <w:rFonts w:eastAsia="Script MT Bold"/>
                 <w:sz w:val="22"/>
                 <w:szCs w:val="22"/>
               </w:rPr>
-              <w:t>Nombre del Docente</w:t>
+              <w:t xml:space="preserve">{{ </w:t>
+            </w:r>
+            <w:proofErr w:type="spellStart"/>
+            <w:r>
+              <w:rPr>
+                <w:rFonts w:eastAsia="Script MT Bold"/>
+                <w:sz w:val="22"/>
+                <w:szCs w:val="22"/>
+              </w:rPr>
+              <w:t>nombre</w:t>
+            </w:r>
+            <w:proofErr w:type="gramEnd"/>
+            <w:r>
+              <w:rPr>
+                <w:rFonts w:eastAsia="Script MT Bold"/>
+                <w:sz w:val="22"/>
+                <w:szCs w:val="22"/>
+              </w:rPr>
+              <w:t>_</w:t>
+            </w:r>
+            <w:proofErr w:type="gramStart"/>
+            <w:r>
+              <w:rPr>
+                <w:rFonts w:eastAsia="Script MT Bold"/>
+                <w:sz w:val="22"/>
+                <w:szCs w:val="22"/>
+              </w:rPr>
+              <w:t>docente</w:t>
+            </w:r>
+            <w:proofErr w:type="spellEnd"/>
+            <w:r>
+              <w:rPr>
+                <w:rFonts w:eastAsia="Script MT Bold"/>
+                <w:sz w:val="22"/>
+                <w:szCs w:val="22"/>
+              </w:rPr>
+              <w:t xml:space="preserve"> }</w:t>
+            </w:r>
+            <w:proofErr w:type="gramEnd"/>
+            <w:r>
+              <w:rPr>
+                <w:rFonts w:eastAsia="Script MT Bold"/>
+                <w:sz w:val="22"/>
+                <w:szCs w:val="22"/>
+              </w:rPr>
+              <w:t>}</w:t>
             </w:r>
           </w:p>
           <w:p>
@@ -6422,6 +6904,7 @@
   <w:style w:type="character" w:default="1" w:styleId="DefaultParagraphFont">
     <w:name w:val="Default Paragraph Font"/>
     <w:uiPriority w:val="1"/>
+    <w:semiHidden/>
     <w:unhideWhenUsed/>
   </w:style>
   <w:style w:type="table" w:default="1" w:styleId="TableNormal">

</xml_diff>

<commit_message>
feat(logic): map rubric data to filas_rubrica and update word template
</commit_message>
<xml_diff>
--- a/src/ai_doc/templates/sesion_template.docx
+++ b/src/ai_doc/templates/sesion_template.docx
@@ -11,7 +11,6 @@
           <w:bCs/>
         </w:rPr>
       </w:pPr>
-      <w:proofErr w:type="gramStart"/>
       <w:r>
         <w:rPr>
           <w:rFonts w:eastAsia="Arial"/>
@@ -25,23 +24,7 @@
           <w:rFonts w:eastAsia="Arial"/>
           <w:bCs/>
         </w:rPr>
-        <w:t>institucion</w:t>
-      </w:r>
-      <w:proofErr w:type="gramEnd"/>
-      <w:r>
-        <w:rPr>
-          <w:rFonts w:eastAsia="Arial"/>
-          <w:bCs/>
-        </w:rPr>
-        <w:t>_</w:t>
-      </w:r>
-      <w:proofErr w:type="gramStart"/>
-      <w:r>
-        <w:rPr>
-          <w:rFonts w:eastAsia="Arial"/>
-          <w:bCs/>
-        </w:rPr>
-        <w:t>educativa</w:t>
+        <w:t>institucion_educativa</w:t>
       </w:r>
       <w:proofErr w:type="spellEnd"/>
       <w:r>
@@ -49,15 +32,7 @@
           <w:rFonts w:eastAsia="Arial"/>
           <w:bCs/>
         </w:rPr>
-        <w:t xml:space="preserve"> }</w:t>
-      </w:r>
-      <w:proofErr w:type="gramEnd"/>
-      <w:r>
-        <w:rPr>
-          <w:rFonts w:eastAsia="Arial"/>
-          <w:bCs/>
-        </w:rPr>
-        <w:t>}</w:t>
+        <w:t xml:space="preserve"> }}</w:t>
       </w:r>
     </w:p>
     <w:p>
@@ -86,21 +61,12 @@
         </w:rPr>
         <w:t xml:space="preserve">TÍTULO DE LA SESIÓN: </w:t>
       </w:r>
-      <w:proofErr w:type="gramStart"/>
       <w:r>
         <w:rPr>
           <w:rFonts w:eastAsia="Arial"/>
           <w:b/>
         </w:rPr>
-        <w:t>{{ titulo</w:t>
-      </w:r>
-      <w:proofErr w:type="gramEnd"/>
-      <w:r>
-        <w:rPr>
-          <w:rFonts w:eastAsia="Arial"/>
-          <w:b/>
-        </w:rPr>
-        <w:t xml:space="preserve"> }}</w:t>
+        <w:t>{{ titulo }}</w:t>
       </w:r>
     </w:p>
     <w:tbl>
@@ -167,7 +133,6 @@
                 <w:szCs w:val="22"/>
               </w:rPr>
             </w:pPr>
-            <w:proofErr w:type="gramStart"/>
             <w:r>
               <w:rPr>
                 <w:rFonts w:eastAsia="Arial"/>
@@ -188,7 +153,6 @@
               <w:t>area</w:t>
             </w:r>
             <w:proofErr w:type="spellEnd"/>
-            <w:proofErr w:type="gramEnd"/>
             <w:r>
               <w:rPr>
                 <w:rFonts w:eastAsia="Arial"/>
@@ -238,25 +202,14 @@
                 <w:szCs w:val="22"/>
               </w:rPr>
             </w:pPr>
-            <w:proofErr w:type="gramStart"/>
-            <w:r>
-              <w:rPr>
-                <w:rFonts w:eastAsia="Arial"/>
-                <w:b/>
-                <w:sz w:val="22"/>
-                <w:szCs w:val="22"/>
-              </w:rPr>
-              <w:t>{{ especialidad</w:t>
-            </w:r>
-            <w:proofErr w:type="gramEnd"/>
-            <w:r>
-              <w:rPr>
-                <w:rFonts w:eastAsia="Arial"/>
-                <w:b/>
-                <w:sz w:val="22"/>
-                <w:szCs w:val="22"/>
-              </w:rPr>
-              <w:t xml:space="preserve"> }}</w:t>
+            <w:r>
+              <w:rPr>
+                <w:rFonts w:eastAsia="Arial"/>
+                <w:b/>
+                <w:sz w:val="22"/>
+                <w:szCs w:val="22"/>
+              </w:rPr>
+              <w:t>{{ especialidad }}</w:t>
             </w:r>
           </w:p>
         </w:tc>
@@ -309,7 +262,6 @@
                 <w:szCs w:val="22"/>
               </w:rPr>
             </w:pPr>
-            <w:proofErr w:type="gramStart"/>
             <w:r>
               <w:rPr>
                 <w:rFonts w:eastAsia="Arial"/>
@@ -327,17 +279,7 @@
                 <w:sz w:val="22"/>
                 <w:szCs w:val="22"/>
               </w:rPr>
-              <w:t>numero</w:t>
-            </w:r>
-            <w:proofErr w:type="gramEnd"/>
-            <w:r>
-              <w:rPr>
-                <w:rFonts w:eastAsia="Arial"/>
-                <w:b/>
-                <w:sz w:val="22"/>
-                <w:szCs w:val="22"/>
-              </w:rPr>
-              <w:t>_sesion</w:t>
+              <w:t>numero_sesion</w:t>
             </w:r>
             <w:proofErr w:type="spellEnd"/>
             <w:r>
@@ -395,7 +337,6 @@
                 <w:szCs w:val="22"/>
               </w:rPr>
             </w:pPr>
-            <w:proofErr w:type="gramStart"/>
             <w:r>
               <w:rPr>
                 <w:rFonts w:eastAsia="Arial"/>
@@ -413,17 +354,7 @@
                 <w:sz w:val="22"/>
                 <w:szCs w:val="22"/>
               </w:rPr>
-              <w:t>nombre</w:t>
-            </w:r>
-            <w:proofErr w:type="gramEnd"/>
-            <w:r>
-              <w:rPr>
-                <w:rFonts w:eastAsia="Arial"/>
-                <w:bCs/>
-                <w:sz w:val="22"/>
-                <w:szCs w:val="22"/>
-              </w:rPr>
-              <w:t>_modulo</w:t>
+              <w:t>nombre_modulo</w:t>
             </w:r>
             <w:proofErr w:type="spellEnd"/>
             <w:r>
@@ -481,7 +412,6 @@
                 <w:szCs w:val="22"/>
               </w:rPr>
             </w:pPr>
-            <w:proofErr w:type="gramStart"/>
             <w:r>
               <w:rPr>
                 <w:rFonts w:eastAsia="Arial"/>
@@ -499,17 +429,7 @@
                 <w:sz w:val="22"/>
                 <w:szCs w:val="22"/>
               </w:rPr>
-              <w:t>nombre</w:t>
-            </w:r>
-            <w:proofErr w:type="gramEnd"/>
-            <w:r>
-              <w:rPr>
-                <w:rFonts w:eastAsia="Arial"/>
-                <w:bCs/>
-                <w:sz w:val="22"/>
-                <w:szCs w:val="22"/>
-              </w:rPr>
-              <w:t>_unidad</w:t>
+              <w:t>nombre_unidad</w:t>
             </w:r>
             <w:proofErr w:type="spellEnd"/>
             <w:r>
@@ -567,7 +487,6 @@
                 <w:szCs w:val="22"/>
               </w:rPr>
             </w:pPr>
-            <w:proofErr w:type="gramStart"/>
             <w:r>
               <w:rPr>
                 <w:rFonts w:eastAsia="Arial"/>
@@ -585,17 +504,7 @@
                 <w:sz w:val="22"/>
                 <w:szCs w:val="22"/>
               </w:rPr>
-              <w:t>nombre</w:t>
-            </w:r>
-            <w:proofErr w:type="gramEnd"/>
-            <w:r>
-              <w:rPr>
-                <w:rFonts w:eastAsia="Arial"/>
-                <w:b/>
-                <w:sz w:val="22"/>
-                <w:szCs w:val="22"/>
-              </w:rPr>
-              <w:t>_docente</w:t>
+              <w:t>nombre_docente</w:t>
             </w:r>
             <w:proofErr w:type="spellEnd"/>
             <w:r>
@@ -654,25 +563,14 @@
                 <w:szCs w:val="22"/>
               </w:rPr>
             </w:pPr>
-            <w:proofErr w:type="gramStart"/>
-            <w:r>
-              <w:rPr>
-                <w:rFonts w:eastAsia="Arial"/>
-                <w:b/>
-                <w:sz w:val="22"/>
-                <w:szCs w:val="22"/>
-              </w:rPr>
-              <w:t>{{ ciclo</w:t>
-            </w:r>
-            <w:proofErr w:type="gramEnd"/>
-            <w:r>
-              <w:rPr>
-                <w:rFonts w:eastAsia="Arial"/>
-                <w:b/>
-                <w:sz w:val="22"/>
-                <w:szCs w:val="22"/>
-              </w:rPr>
-              <w:t xml:space="preserve"> }}</w:t>
+            <w:r>
+              <w:rPr>
+                <w:rFonts w:eastAsia="Arial"/>
+                <w:b/>
+                <w:sz w:val="22"/>
+                <w:szCs w:val="22"/>
+              </w:rPr>
+              <w:t>{{ ciclo }}</w:t>
             </w:r>
           </w:p>
         </w:tc>
@@ -725,7 +623,6 @@
                 <w:szCs w:val="22"/>
               </w:rPr>
             </w:pPr>
-            <w:proofErr w:type="gramStart"/>
             <w:r>
               <w:rPr>
                 <w:rFonts w:eastAsia="Arial"/>
@@ -743,17 +640,7 @@
                 <w:sz w:val="22"/>
                 <w:szCs w:val="22"/>
               </w:rPr>
-              <w:t>grado</w:t>
-            </w:r>
-            <w:proofErr w:type="gramEnd"/>
-            <w:r>
-              <w:rPr>
-                <w:rFonts w:eastAsia="Arial"/>
-                <w:b/>
-                <w:sz w:val="22"/>
-                <w:szCs w:val="22"/>
-              </w:rPr>
-              <w:t>_seccion</w:t>
+              <w:t>grado_seccion</w:t>
             </w:r>
             <w:proofErr w:type="spellEnd"/>
             <w:r>
@@ -831,25 +718,14 @@
                 <w:szCs w:val="22"/>
               </w:rPr>
             </w:pPr>
-            <w:proofErr w:type="gramStart"/>
-            <w:r>
-              <w:rPr>
-                <w:rFonts w:eastAsia="Arial"/>
-                <w:b/>
-                <w:sz w:val="22"/>
-                <w:szCs w:val="22"/>
-              </w:rPr>
-              <w:t>{{ fecha</w:t>
-            </w:r>
-            <w:proofErr w:type="gramEnd"/>
-            <w:r>
-              <w:rPr>
-                <w:rFonts w:eastAsia="Arial"/>
-                <w:b/>
-                <w:sz w:val="22"/>
-                <w:szCs w:val="22"/>
-              </w:rPr>
-              <w:t xml:space="preserve"> }}</w:t>
+            <w:r>
+              <w:rPr>
+                <w:rFonts w:eastAsia="Arial"/>
+                <w:b/>
+                <w:sz w:val="22"/>
+                <w:szCs w:val="22"/>
+              </w:rPr>
+              <w:t>{{ fecha }}</w:t>
             </w:r>
           </w:p>
         </w:tc>
@@ -981,25 +857,14 @@
                 <w:szCs w:val="22"/>
               </w:rPr>
             </w:pPr>
-            <w:proofErr w:type="gramStart"/>
-            <w:r>
-              <w:rPr>
-                <w:rFonts w:eastAsia="Arial"/>
-                <w:b/>
-                <w:sz w:val="22"/>
-                <w:szCs w:val="22"/>
-              </w:rPr>
-              <w:t>{{ fecha</w:t>
-            </w:r>
-            <w:proofErr w:type="gramEnd"/>
-            <w:r>
-              <w:rPr>
-                <w:rFonts w:eastAsia="Arial"/>
-                <w:b/>
-                <w:sz w:val="22"/>
-                <w:szCs w:val="22"/>
-              </w:rPr>
-              <w:t xml:space="preserve"> }}</w:t>
+            <w:r>
+              <w:rPr>
+                <w:rFonts w:eastAsia="Arial"/>
+                <w:b/>
+                <w:sz w:val="22"/>
+                <w:szCs w:val="22"/>
+              </w:rPr>
+              <w:t>{{ fecha }}</w:t>
             </w:r>
           </w:p>
         </w:tc>
@@ -1104,7 +969,6 @@
                 <w:szCs w:val="22"/>
               </w:rPr>
             </w:pPr>
-            <w:proofErr w:type="gramStart"/>
             <w:r>
               <w:rPr>
                 <w:rFonts w:eastAsia="Arial"/>
@@ -1125,7 +989,6 @@
               <w:t>proposito</w:t>
             </w:r>
             <w:proofErr w:type="spellEnd"/>
-            <w:proofErr w:type="gramEnd"/>
             <w:r>
               <w:rPr>
                 <w:rFonts w:eastAsia="Arial"/>
@@ -1281,7 +1144,6 @@
                 <w:lang w:val="es-PE"/>
               </w:rPr>
             </w:pPr>
-            <w:proofErr w:type="gramStart"/>
             <w:r>
               <w:rPr>
                 <w:rFonts w:ascii="Times New Roman" w:hAnsi="Times New Roman" w:cs="Times New Roman"/>
@@ -1295,15 +1157,7 @@
                 <w:rFonts w:ascii="Times New Roman" w:hAnsi="Times New Roman" w:cs="Times New Roman"/>
                 <w:lang w:val="es-PE"/>
               </w:rPr>
-              <w:t>indicador</w:t>
-            </w:r>
-            <w:proofErr w:type="gramEnd"/>
-            <w:r>
-              <w:rPr>
-                <w:rFonts w:ascii="Times New Roman" w:hAnsi="Times New Roman" w:cs="Times New Roman"/>
-                <w:lang w:val="es-PE"/>
-              </w:rPr>
-              <w:t>_logro</w:t>
+              <w:t>indicador_logro</w:t>
             </w:r>
             <w:proofErr w:type="spellEnd"/>
             <w:r>
@@ -1340,7 +1194,6 @@
                 <w:szCs w:val="22"/>
               </w:rPr>
             </w:pPr>
-            <w:proofErr w:type="gramStart"/>
             <w:r>
               <w:rPr>
                 <w:sz w:val="22"/>
@@ -1357,7 +1210,6 @@
               <w:t>desempeno</w:t>
             </w:r>
             <w:proofErr w:type="spellEnd"/>
-            <w:proofErr w:type="gramEnd"/>
             <w:r>
               <w:rPr>
                 <w:sz w:val="22"/>
@@ -1387,7 +1239,6 @@
                 <w:lang w:eastAsia="es-PE"/>
               </w:rPr>
             </w:pPr>
-            <w:proofErr w:type="gramStart"/>
             <w:r>
               <w:rPr>
                 <w:rFonts w:ascii="Times New Roman" w:eastAsia="Times New Roman" w:hAnsi="Times New Roman" w:cs="Times New Roman"/>
@@ -1401,15 +1252,7 @@
                 <w:rFonts w:ascii="Times New Roman" w:eastAsia="Times New Roman" w:hAnsi="Times New Roman" w:cs="Times New Roman"/>
                 <w:lang w:val="es-PE" w:eastAsia="es-PE"/>
               </w:rPr>
-              <w:t>campo</w:t>
-            </w:r>
-            <w:proofErr w:type="gramEnd"/>
-            <w:r>
-              <w:rPr>
-                <w:rFonts w:ascii="Times New Roman" w:eastAsia="Times New Roman" w:hAnsi="Times New Roman" w:cs="Times New Roman"/>
-                <w:lang w:val="es-PE" w:eastAsia="es-PE"/>
-              </w:rPr>
-              <w:t>_tematico</w:t>
+              <w:t>campo_tematico</w:t>
             </w:r>
             <w:proofErr w:type="spellEnd"/>
             <w:r>
@@ -1667,7 +1510,6 @@
                 <w:szCs w:val="22"/>
               </w:rPr>
             </w:pPr>
-            <w:proofErr w:type="gramStart"/>
             <w:r>
               <w:rPr>
                 <w:rFonts w:eastAsia="Arial"/>
@@ -1683,16 +1525,7 @@
                 <w:sz w:val="22"/>
                 <w:szCs w:val="22"/>
               </w:rPr>
-              <w:t>criterio</w:t>
-            </w:r>
-            <w:proofErr w:type="gramEnd"/>
-            <w:r>
-              <w:rPr>
-                <w:rFonts w:eastAsia="Arial"/>
-                <w:sz w:val="22"/>
-                <w:szCs w:val="22"/>
-              </w:rPr>
-              <w:t>_desempeno</w:t>
+              <w:t>criterio_desempeno</w:t>
             </w:r>
             <w:proofErr w:type="spellEnd"/>
             <w:r>
@@ -1724,23 +1557,13 @@
                 <w:szCs w:val="22"/>
               </w:rPr>
             </w:pPr>
-            <w:proofErr w:type="gramStart"/>
-            <w:r>
-              <w:rPr>
-                <w:rFonts w:eastAsia="Arial"/>
-                <w:sz w:val="22"/>
-                <w:szCs w:val="22"/>
-              </w:rPr>
-              <w:t>{{ instrumento</w:t>
-            </w:r>
-            <w:proofErr w:type="gramEnd"/>
-            <w:r>
-              <w:rPr>
-                <w:rFonts w:eastAsia="Arial"/>
-                <w:sz w:val="22"/>
-                <w:szCs w:val="22"/>
-              </w:rPr>
-              <w:t xml:space="preserve"> }}</w:t>
+            <w:r>
+              <w:rPr>
+                <w:rFonts w:eastAsia="Arial"/>
+                <w:sz w:val="22"/>
+                <w:szCs w:val="22"/>
+              </w:rPr>
+              <w:t>{{ instrumento }}</w:t>
             </w:r>
           </w:p>
         </w:tc>
@@ -1763,7 +1586,6 @@
                 <w:lang w:val="es-ES" w:eastAsia="en-US"/>
               </w:rPr>
             </w:pPr>
-            <w:proofErr w:type="gramStart"/>
             <w:r>
               <w:rPr>
                 <w:rFonts w:eastAsia="Calibri"/>
@@ -1781,17 +1603,7 @@
                 <w:szCs w:val="22"/>
                 <w:lang w:eastAsia="en-US"/>
               </w:rPr>
-              <w:t>evidencia</w:t>
-            </w:r>
-            <w:proofErr w:type="gramEnd"/>
-            <w:r>
-              <w:rPr>
-                <w:rFonts w:eastAsia="Calibri"/>
-                <w:sz w:val="22"/>
-                <w:szCs w:val="22"/>
-                <w:lang w:eastAsia="en-US"/>
-              </w:rPr>
-              <w:t>_proceso</w:t>
+              <w:t>evidencia_proceso</w:t>
             </w:r>
             <w:proofErr w:type="spellEnd"/>
             <w:r>
@@ -1958,7 +1770,6 @@
                 <w:szCs w:val="22"/>
               </w:rPr>
             </w:pPr>
-            <w:proofErr w:type="gramStart"/>
             <w:r>
               <w:rPr>
                 <w:sz w:val="22"/>
@@ -1972,15 +1783,7 @@
                 <w:sz w:val="22"/>
                 <w:szCs w:val="22"/>
               </w:rPr>
-              <w:t>evidencia</w:t>
-            </w:r>
-            <w:proofErr w:type="gramEnd"/>
-            <w:r>
-              <w:rPr>
-                <w:sz w:val="22"/>
-                <w:szCs w:val="22"/>
-              </w:rPr>
-              <w:t>_producto_final</w:t>
+              <w:t>evidencia_producto_final</w:t>
             </w:r>
             <w:proofErr w:type="spellEnd"/>
             <w:r>
@@ -2137,7 +1940,6 @@
                 <w:szCs w:val="22"/>
               </w:rPr>
             </w:pPr>
-            <w:proofErr w:type="gramStart"/>
             <w:r>
               <w:rPr>
                 <w:sz w:val="22"/>
@@ -2151,15 +1953,7 @@
                 <w:sz w:val="22"/>
                 <w:szCs w:val="22"/>
               </w:rPr>
-              <w:t>evidencia</w:t>
-            </w:r>
-            <w:proofErr w:type="gramEnd"/>
-            <w:r>
-              <w:rPr>
-                <w:sz w:val="22"/>
-                <w:szCs w:val="22"/>
-              </w:rPr>
-              <w:t>_actuacion</w:t>
+              <w:t>evidencia_actuacion</w:t>
             </w:r>
             <w:proofErr w:type="spellEnd"/>
             <w:r>
@@ -2224,14 +2018,14 @@
         <w:tblLook w:val="04A0" w:firstRow="1" w:lastRow="0" w:firstColumn="1" w:lastColumn="0" w:noHBand="0" w:noVBand="1"/>
       </w:tblPr>
       <w:tblGrid>
-        <w:gridCol w:w="2694"/>
-        <w:gridCol w:w="6379"/>
-        <w:gridCol w:w="1275"/>
+        <w:gridCol w:w="2450"/>
+        <w:gridCol w:w="4981"/>
+        <w:gridCol w:w="2917"/>
       </w:tblGrid>
       <w:tr>
         <w:tc>
           <w:tcPr>
-            <w:tcW w:w="2694" w:type="dxa"/>
+            <w:tcW w:w="2450" w:type="dxa"/>
             <w:shd w:val="clear" w:color="auto" w:fill="FFFFFF" w:themeFill="background1"/>
             <w:vAlign w:val="center"/>
           </w:tcPr>
@@ -2259,7 +2053,7 @@
         </w:tc>
         <w:tc>
           <w:tcPr>
-            <w:tcW w:w="6379" w:type="dxa"/>
+            <w:tcW w:w="4981" w:type="dxa"/>
             <w:shd w:val="clear" w:color="auto" w:fill="FFFFFF" w:themeFill="background1"/>
           </w:tcPr>
           <w:p>
@@ -2285,7 +2079,7 @@
         </w:tc>
         <w:tc>
           <w:tcPr>
-            <w:tcW w:w="1275" w:type="dxa"/>
+            <w:tcW w:w="2917" w:type="dxa"/>
             <w:shd w:val="clear" w:color="auto" w:fill="FFFFFF" w:themeFill="background1"/>
           </w:tcPr>
           <w:p>
@@ -2316,7 +2110,7 @@
         </w:trPr>
         <w:tc>
           <w:tcPr>
-            <w:tcW w:w="2694" w:type="dxa"/>
+            <w:tcW w:w="2450" w:type="dxa"/>
             <w:shd w:val="clear" w:color="auto" w:fill="FFFFFF" w:themeFill="background1"/>
             <w:vAlign w:val="center"/>
           </w:tcPr>
@@ -2344,7 +2138,7 @@
         </w:tc>
         <w:tc>
           <w:tcPr>
-            <w:tcW w:w="6379" w:type="dxa"/>
+            <w:tcW w:w="4981" w:type="dxa"/>
           </w:tcPr>
           <w:p>
             <w:pPr>
@@ -2355,7 +2149,6 @@
                 <w:szCs w:val="22"/>
               </w:rPr>
             </w:pPr>
-            <w:proofErr w:type="gramStart"/>
             <w:r>
               <w:rPr>
                 <w:rFonts w:eastAsia="Calibri"/>
@@ -2371,16 +2164,58 @@
                 <w:sz w:val="22"/>
                 <w:szCs w:val="22"/>
               </w:rPr>
-              <w:t>proposito</w:t>
-            </w:r>
-            <w:proofErr w:type="gramEnd"/>
+              <w:t>proposito_aprendizaje</w:t>
+            </w:r>
+            <w:proofErr w:type="spellEnd"/>
             <w:r>
               <w:rPr>
                 <w:rFonts w:eastAsia="Calibri"/>
                 <w:sz w:val="22"/>
                 <w:szCs w:val="22"/>
               </w:rPr>
-              <w:t>_aprendizaje</w:t>
+              <w:t xml:space="preserve"> }}</w:t>
+            </w:r>
+          </w:p>
+        </w:tc>
+        <w:tc>
+          <w:tcPr>
+            <w:tcW w:w="2917" w:type="dxa"/>
+            <w:vAlign w:val="center"/>
+          </w:tcPr>
+          <w:p>
+            <w:pPr>
+              <w:jc w:val="center"/>
+              <w:rPr>
+                <w:rFonts w:eastAsia="Arial"/>
+                <w:bCs/>
+                <w:sz w:val="22"/>
+                <w:szCs w:val="22"/>
+              </w:rPr>
+            </w:pPr>
+            <w:r>
+              <w:rPr>
+                <w:rFonts w:eastAsia="Calibri"/>
+                <w:sz w:val="22"/>
+                <w:szCs w:val="22"/>
+              </w:rPr>
+              <w:t xml:space="preserve">{{ </w:t>
+            </w:r>
+            <w:proofErr w:type="spellStart"/>
+            <w:r>
+              <w:rPr>
+                <w:rFonts w:eastAsia="Calibri"/>
+                <w:sz w:val="22"/>
+                <w:szCs w:val="22"/>
+              </w:rPr>
+              <w:t>tiempo_</w:t>
+            </w:r>
+            <w:r>
+              <w:rPr>
+                <w:rFonts w:eastAsia="Calibri"/>
+                <w:sz w:val="22"/>
+                <w:szCs w:val="22"/>
+              </w:rPr>
+              <w:t>proposito_aprendizaje</w:t>
             </w:r>
             <w:proofErr w:type="spellEnd"/>
             <w:r>
@@ -2391,23 +2226,6 @@
               </w:rPr>
               <w:t xml:space="preserve"> }}</w:t>
             </w:r>
-          </w:p>
-        </w:tc>
-        <w:tc>
-          <w:tcPr>
-            <w:tcW w:w="1275" w:type="dxa"/>
-            <w:vAlign w:val="center"/>
-          </w:tcPr>
-          <w:p>
-            <w:pPr>
-              <w:jc w:val="center"/>
-              <w:rPr>
-                <w:rFonts w:eastAsia="Arial"/>
-                <w:bCs/>
-                <w:sz w:val="22"/>
-                <w:szCs w:val="22"/>
-              </w:rPr>
-            </w:pPr>
           </w:p>
         </w:tc>
       </w:tr>
@@ -2417,7 +2235,7 @@
         </w:trPr>
         <w:tc>
           <w:tcPr>
-            <w:tcW w:w="2694" w:type="dxa"/>
+            <w:tcW w:w="2450" w:type="dxa"/>
             <w:shd w:val="clear" w:color="auto" w:fill="FFFFFF" w:themeFill="background1"/>
             <w:vAlign w:val="center"/>
           </w:tcPr>
@@ -2445,7 +2263,7 @@
         </w:tc>
         <w:tc>
           <w:tcPr>
-            <w:tcW w:w="6379" w:type="dxa"/>
+            <w:tcW w:w="4981" w:type="dxa"/>
           </w:tcPr>
           <w:p>
             <w:pPr>
@@ -2455,7 +2273,6 @@
                 <w:szCs w:val="22"/>
               </w:rPr>
             </w:pPr>
-            <w:proofErr w:type="gramStart"/>
             <w:r>
               <w:rPr>
                 <w:sz w:val="22"/>
@@ -2472,7 +2289,6 @@
               <w:t>introduccion</w:t>
             </w:r>
             <w:proofErr w:type="spellEnd"/>
-            <w:proofErr w:type="gramEnd"/>
             <w:r>
               <w:rPr>
                 <w:sz w:val="22"/>
@@ -2484,7 +2300,7 @@
         </w:tc>
         <w:tc>
           <w:tcPr>
-            <w:tcW w:w="1275" w:type="dxa"/>
+            <w:tcW w:w="2917" w:type="dxa"/>
             <w:vAlign w:val="center"/>
           </w:tcPr>
           <w:p>
@@ -2497,6 +2313,36 @@
                 <w:szCs w:val="22"/>
               </w:rPr>
             </w:pPr>
+            <w:r>
+              <w:rPr>
+                <w:sz w:val="22"/>
+                <w:szCs w:val="22"/>
+              </w:rPr>
+              <w:t xml:space="preserve">{{ </w:t>
+            </w:r>
+            <w:proofErr w:type="spellStart"/>
+            <w:r>
+              <w:rPr>
+                <w:sz w:val="22"/>
+                <w:szCs w:val="22"/>
+              </w:rPr>
+              <w:t>tiempo_</w:t>
+            </w:r>
+            <w:r>
+              <w:rPr>
+                <w:sz w:val="22"/>
+                <w:szCs w:val="22"/>
+              </w:rPr>
+              <w:t>introduccion</w:t>
+            </w:r>
+            <w:proofErr w:type="spellEnd"/>
+            <w:r>
+              <w:rPr>
+                <w:sz w:val="22"/>
+                <w:szCs w:val="22"/>
+              </w:rPr>
+              <w:t xml:space="preserve"> }}</w:t>
+            </w:r>
           </w:p>
         </w:tc>
       </w:tr>
@@ -2506,7 +2352,7 @@
         </w:trPr>
         <w:tc>
           <w:tcPr>
-            <w:tcW w:w="2694" w:type="dxa"/>
+            <w:tcW w:w="2450" w:type="dxa"/>
             <w:shd w:val="clear" w:color="auto" w:fill="FFFFFF" w:themeFill="background1"/>
             <w:vAlign w:val="center"/>
           </w:tcPr>
@@ -2534,18 +2380,17 @@
         </w:tc>
         <w:tc>
           <w:tcPr>
-            <w:tcW w:w="6379" w:type="dxa"/>
-          </w:tcPr>
-          <w:p>
-            <w:pPr>
-              <w:rPr>
-                <w:rFonts w:eastAsia="Arial"/>
-                <w:bCs/>
-                <w:sz w:val="22"/>
-                <w:szCs w:val="22"/>
-              </w:rPr>
-            </w:pPr>
-            <w:proofErr w:type="gramStart"/>
+            <w:tcW w:w="4981" w:type="dxa"/>
+          </w:tcPr>
+          <w:p>
+            <w:pPr>
+              <w:rPr>
+                <w:rFonts w:eastAsia="Arial"/>
+                <w:bCs/>
+                <w:sz w:val="22"/>
+                <w:szCs w:val="22"/>
+              </w:rPr>
+            </w:pPr>
             <w:r>
               <w:rPr>
                 <w:rFonts w:eastAsia="Arial"/>
@@ -2563,17 +2408,7 @@
                 <w:sz w:val="22"/>
                 <w:szCs w:val="22"/>
               </w:rPr>
-              <w:t>desarrollo</w:t>
-            </w:r>
-            <w:proofErr w:type="gramEnd"/>
-            <w:r>
-              <w:rPr>
-                <w:rFonts w:eastAsia="Arial"/>
-                <w:bCs/>
-                <w:sz w:val="22"/>
-                <w:szCs w:val="22"/>
-              </w:rPr>
-              <w:t>_contenidos</w:t>
+              <w:t>desarrollo_contenidos</w:t>
             </w:r>
             <w:proofErr w:type="spellEnd"/>
             <w:r>
@@ -2589,7 +2424,7 @@
         </w:tc>
         <w:tc>
           <w:tcPr>
-            <w:tcW w:w="1275" w:type="dxa"/>
+            <w:tcW w:w="2917" w:type="dxa"/>
             <w:vAlign w:val="center"/>
           </w:tcPr>
           <w:p>
@@ -2602,6 +2437,44 @@
                 <w:szCs w:val="22"/>
               </w:rPr>
             </w:pPr>
+            <w:r>
+              <w:rPr>
+                <w:rFonts w:eastAsia="Arial"/>
+                <w:bCs/>
+                <w:sz w:val="22"/>
+                <w:szCs w:val="22"/>
+              </w:rPr>
+              <w:t xml:space="preserve">{{ </w:t>
+            </w:r>
+            <w:proofErr w:type="spellStart"/>
+            <w:r>
+              <w:rPr>
+                <w:rFonts w:eastAsia="Arial"/>
+                <w:bCs/>
+                <w:sz w:val="22"/>
+                <w:szCs w:val="22"/>
+              </w:rPr>
+              <w:t>tiempo_</w:t>
+            </w:r>
+            <w:r>
+              <w:rPr>
+                <w:rFonts w:eastAsia="Arial"/>
+                <w:bCs/>
+                <w:sz w:val="22"/>
+                <w:szCs w:val="22"/>
+              </w:rPr>
+              <w:t>desarrollo_contenidos</w:t>
+            </w:r>
+            <w:proofErr w:type="spellEnd"/>
+            <w:r>
+              <w:rPr>
+                <w:rFonts w:eastAsia="Arial"/>
+                <w:bCs/>
+                <w:sz w:val="22"/>
+                <w:szCs w:val="22"/>
+              </w:rPr>
+              <w:t xml:space="preserve"> }}</w:t>
+            </w:r>
           </w:p>
         </w:tc>
       </w:tr>
@@ -2611,7 +2484,7 @@
         </w:trPr>
         <w:tc>
           <w:tcPr>
-            <w:tcW w:w="2694" w:type="dxa"/>
+            <w:tcW w:w="2450" w:type="dxa"/>
             <w:shd w:val="clear" w:color="auto" w:fill="FFFFFF" w:themeFill="background1"/>
             <w:vAlign w:val="center"/>
           </w:tcPr>
@@ -2639,18 +2512,17 @@
         </w:tc>
         <w:tc>
           <w:tcPr>
-            <w:tcW w:w="6379" w:type="dxa"/>
-          </w:tcPr>
-          <w:p>
-            <w:pPr>
-              <w:rPr>
-                <w:rFonts w:eastAsia="Arial"/>
-                <w:bCs/>
-                <w:sz w:val="22"/>
-                <w:szCs w:val="22"/>
-              </w:rPr>
-            </w:pPr>
-            <w:proofErr w:type="gramStart"/>
+            <w:tcW w:w="4981" w:type="dxa"/>
+          </w:tcPr>
+          <w:p>
+            <w:pPr>
+              <w:rPr>
+                <w:rFonts w:eastAsia="Arial"/>
+                <w:bCs/>
+                <w:sz w:val="22"/>
+                <w:szCs w:val="22"/>
+              </w:rPr>
+            </w:pPr>
             <w:r>
               <w:rPr>
                 <w:rFonts w:eastAsia="Arial"/>
@@ -2668,17 +2540,7 @@
                 <w:sz w:val="22"/>
                 <w:szCs w:val="22"/>
               </w:rPr>
-              <w:t>desarrollo</w:t>
-            </w:r>
-            <w:proofErr w:type="gramEnd"/>
-            <w:r>
-              <w:rPr>
-                <w:rFonts w:eastAsia="Arial"/>
-                <w:bCs/>
-                <w:sz w:val="22"/>
-                <w:szCs w:val="22"/>
-              </w:rPr>
-              <w:t>_actividades</w:t>
+              <w:t>desarrollo_actividades</w:t>
             </w:r>
             <w:proofErr w:type="spellEnd"/>
             <w:r>
@@ -2694,7 +2556,7 @@
         </w:tc>
         <w:tc>
           <w:tcPr>
-            <w:tcW w:w="1275" w:type="dxa"/>
+            <w:tcW w:w="2917" w:type="dxa"/>
             <w:vAlign w:val="center"/>
           </w:tcPr>
           <w:p>
@@ -2707,6 +2569,44 @@
                 <w:szCs w:val="22"/>
               </w:rPr>
             </w:pPr>
+            <w:r>
+              <w:rPr>
+                <w:rFonts w:eastAsia="Arial"/>
+                <w:bCs/>
+                <w:sz w:val="22"/>
+                <w:szCs w:val="22"/>
+              </w:rPr>
+              <w:t xml:space="preserve">{{ </w:t>
+            </w:r>
+            <w:proofErr w:type="spellStart"/>
+            <w:r>
+              <w:rPr>
+                <w:rFonts w:eastAsia="Arial"/>
+                <w:bCs/>
+                <w:sz w:val="22"/>
+                <w:szCs w:val="22"/>
+              </w:rPr>
+              <w:t>tiempo_</w:t>
+            </w:r>
+            <w:r>
+              <w:rPr>
+                <w:rFonts w:eastAsia="Arial"/>
+                <w:bCs/>
+                <w:sz w:val="22"/>
+                <w:szCs w:val="22"/>
+              </w:rPr>
+              <w:t>desarrollo_actividades</w:t>
+            </w:r>
+            <w:proofErr w:type="spellEnd"/>
+            <w:r>
+              <w:rPr>
+                <w:rFonts w:eastAsia="Arial"/>
+                <w:bCs/>
+                <w:sz w:val="22"/>
+                <w:szCs w:val="22"/>
+              </w:rPr>
+              <w:t xml:space="preserve"> }}</w:t>
+            </w:r>
           </w:p>
         </w:tc>
       </w:tr>
@@ -2716,7 +2616,7 @@
         </w:trPr>
         <w:tc>
           <w:tcPr>
-            <w:tcW w:w="2694" w:type="dxa"/>
+            <w:tcW w:w="2450" w:type="dxa"/>
             <w:shd w:val="clear" w:color="auto" w:fill="FFFFFF" w:themeFill="background1"/>
             <w:vAlign w:val="center"/>
           </w:tcPr>
@@ -2744,7 +2644,7 @@
         </w:tc>
         <w:tc>
           <w:tcPr>
-            <w:tcW w:w="6379" w:type="dxa"/>
+            <w:tcW w:w="4981" w:type="dxa"/>
             <w:shd w:val="clear" w:color="auto" w:fill="FFFFFF" w:themeFill="background1"/>
           </w:tcPr>
           <w:p>
@@ -2758,7 +2658,6 @@
                 <w:szCs w:val="22"/>
               </w:rPr>
             </w:pPr>
-            <w:proofErr w:type="gramStart"/>
             <w:r>
               <w:rPr>
                 <w:rFonts w:eastAsia="Arial"/>
@@ -2774,16 +2673,7 @@
                 <w:sz w:val="22"/>
                 <w:szCs w:val="22"/>
               </w:rPr>
-              <w:t>evaluacion</w:t>
-            </w:r>
-            <w:proofErr w:type="gramEnd"/>
-            <w:r>
-              <w:rPr>
-                <w:rFonts w:eastAsia="Arial"/>
-                <w:sz w:val="22"/>
-                <w:szCs w:val="22"/>
-              </w:rPr>
-              <w:t>_formativa</w:t>
+              <w:t>evaluacion_formativa</w:t>
             </w:r>
             <w:proofErr w:type="spellEnd"/>
             <w:r>
@@ -2798,7 +2688,7 @@
         </w:tc>
         <w:tc>
           <w:tcPr>
-            <w:tcW w:w="1275" w:type="dxa"/>
+            <w:tcW w:w="2917" w:type="dxa"/>
             <w:vAlign w:val="center"/>
           </w:tcPr>
           <w:p>
@@ -2811,6 +2701,40 @@
                 <w:szCs w:val="22"/>
               </w:rPr>
             </w:pPr>
+            <w:r>
+              <w:rPr>
+                <w:rFonts w:eastAsia="Arial"/>
+                <w:sz w:val="22"/>
+                <w:szCs w:val="22"/>
+              </w:rPr>
+              <w:t xml:space="preserve">{{ </w:t>
+            </w:r>
+            <w:proofErr w:type="spellStart"/>
+            <w:r>
+              <w:rPr>
+                <w:rFonts w:eastAsia="Arial"/>
+                <w:sz w:val="22"/>
+                <w:szCs w:val="22"/>
+              </w:rPr>
+              <w:t>tiempo_</w:t>
+            </w:r>
+            <w:r>
+              <w:rPr>
+                <w:rFonts w:eastAsia="Arial"/>
+                <w:sz w:val="22"/>
+                <w:szCs w:val="22"/>
+              </w:rPr>
+              <w:t>evaluacion_formativa</w:t>
+            </w:r>
+            <w:proofErr w:type="spellEnd"/>
+            <w:r>
+              <w:rPr>
+                <w:rFonts w:eastAsia="Arial"/>
+                <w:sz w:val="22"/>
+                <w:szCs w:val="22"/>
+              </w:rPr>
+              <w:t xml:space="preserve"> }}</w:t>
+            </w:r>
           </w:p>
         </w:tc>
       </w:tr>
@@ -2820,7 +2744,7 @@
         </w:trPr>
         <w:tc>
           <w:tcPr>
-            <w:tcW w:w="2694" w:type="dxa"/>
+            <w:tcW w:w="2450" w:type="dxa"/>
             <w:shd w:val="clear" w:color="auto" w:fill="FFFFFF" w:themeFill="background1"/>
             <w:vAlign w:val="center"/>
           </w:tcPr>
@@ -2842,13 +2766,14 @@
                 <w:sz w:val="22"/>
                 <w:szCs w:val="22"/>
               </w:rPr>
+              <w:lastRenderedPageBreak/>
               <w:t>Retroalimentación (Transversal)</w:t>
             </w:r>
           </w:p>
         </w:tc>
         <w:tc>
           <w:tcPr>
-            <w:tcW w:w="6379" w:type="dxa"/>
+            <w:tcW w:w="4981" w:type="dxa"/>
           </w:tcPr>
           <w:p>
             <w:pPr>
@@ -2858,7 +2783,6 @@
                 <w:szCs w:val="22"/>
               </w:rPr>
             </w:pPr>
-            <w:proofErr w:type="gramStart"/>
             <w:r>
               <w:rPr>
                 <w:sz w:val="22"/>
@@ -2875,7 +2799,6 @@
               <w:t>retroalimentacion</w:t>
             </w:r>
             <w:proofErr w:type="spellEnd"/>
-            <w:proofErr w:type="gramEnd"/>
             <w:r>
               <w:rPr>
                 <w:sz w:val="22"/>
@@ -2887,7 +2810,7 @@
         </w:tc>
         <w:tc>
           <w:tcPr>
-            <w:tcW w:w="1275" w:type="dxa"/>
+            <w:tcW w:w="2917" w:type="dxa"/>
             <w:vAlign w:val="center"/>
           </w:tcPr>
           <w:p>
@@ -2900,6 +2823,36 @@
                 <w:szCs w:val="22"/>
               </w:rPr>
             </w:pPr>
+            <w:r>
+              <w:rPr>
+                <w:sz w:val="22"/>
+                <w:szCs w:val="22"/>
+              </w:rPr>
+              <w:t xml:space="preserve">{{ </w:t>
+            </w:r>
+            <w:proofErr w:type="spellStart"/>
+            <w:r>
+              <w:rPr>
+                <w:sz w:val="22"/>
+                <w:szCs w:val="22"/>
+              </w:rPr>
+              <w:t>tiempo_</w:t>
+            </w:r>
+            <w:r>
+              <w:rPr>
+                <w:sz w:val="22"/>
+                <w:szCs w:val="22"/>
+              </w:rPr>
+              <w:t>retroalimentacion</w:t>
+            </w:r>
+            <w:proofErr w:type="spellEnd"/>
+            <w:r>
+              <w:rPr>
+                <w:sz w:val="22"/>
+                <w:szCs w:val="22"/>
+              </w:rPr>
+              <w:t xml:space="preserve"> }}</w:t>
+            </w:r>
           </w:p>
         </w:tc>
       </w:tr>
@@ -2909,7 +2862,7 @@
         </w:trPr>
         <w:tc>
           <w:tcPr>
-            <w:tcW w:w="2694" w:type="dxa"/>
+            <w:tcW w:w="2450" w:type="dxa"/>
             <w:shd w:val="clear" w:color="auto" w:fill="FFFFFF" w:themeFill="background1"/>
             <w:vAlign w:val="center"/>
           </w:tcPr>
@@ -2931,14 +2884,13 @@
                 <w:sz w:val="22"/>
                 <w:szCs w:val="22"/>
               </w:rPr>
-              <w:lastRenderedPageBreak/>
               <w:t>Cierre</w:t>
             </w:r>
           </w:p>
         </w:tc>
         <w:tc>
           <w:tcPr>
-            <w:tcW w:w="6379" w:type="dxa"/>
+            <w:tcW w:w="4981" w:type="dxa"/>
           </w:tcPr>
           <w:p>
             <w:pPr>
@@ -2948,15 +2900,53 @@
                 <w:szCs w:val="22"/>
               </w:rPr>
             </w:pPr>
-            <w:proofErr w:type="gramStart"/>
-            <w:r>
-              <w:rPr>
-                <w:sz w:val="22"/>
-                <w:szCs w:val="22"/>
-              </w:rPr>
-              <w:t>{{ cierre</w:t>
-            </w:r>
-            <w:proofErr w:type="gramEnd"/>
+            <w:r>
+              <w:rPr>
+                <w:sz w:val="22"/>
+                <w:szCs w:val="22"/>
+              </w:rPr>
+              <w:t>{{ cierre }}</w:t>
+            </w:r>
+          </w:p>
+        </w:tc>
+        <w:tc>
+          <w:tcPr>
+            <w:tcW w:w="2917" w:type="dxa"/>
+            <w:vAlign w:val="center"/>
+          </w:tcPr>
+          <w:p>
+            <w:pPr>
+              <w:jc w:val="center"/>
+              <w:rPr>
+                <w:rFonts w:eastAsia="Arial"/>
+                <w:bCs/>
+                <w:sz w:val="22"/>
+                <w:szCs w:val="22"/>
+              </w:rPr>
+            </w:pPr>
+            <w:r>
+              <w:rPr>
+                <w:sz w:val="22"/>
+                <w:szCs w:val="22"/>
+              </w:rPr>
+              <w:t xml:space="preserve">{{ </w:t>
+            </w:r>
+            <w:proofErr w:type="spellStart"/>
+            <w:r>
+              <w:rPr>
+                <w:sz w:val="22"/>
+                <w:szCs w:val="22"/>
+              </w:rPr>
+              <w:t>tiempo_</w:t>
+            </w:r>
+            <w:r>
+              <w:rPr>
+                <w:sz w:val="22"/>
+                <w:szCs w:val="22"/>
+              </w:rPr>
+              <w:t>cierre</w:t>
+            </w:r>
+            <w:proofErr w:type="spellEnd"/>
             <w:r>
               <w:rPr>
                 <w:sz w:val="22"/>
@@ -2964,23 +2954,6 @@
               </w:rPr>
               <w:t xml:space="preserve"> }}</w:t>
             </w:r>
-          </w:p>
-        </w:tc>
-        <w:tc>
-          <w:tcPr>
-            <w:tcW w:w="1275" w:type="dxa"/>
-            <w:vAlign w:val="center"/>
-          </w:tcPr>
-          <w:p>
-            <w:pPr>
-              <w:jc w:val="center"/>
-              <w:rPr>
-                <w:rFonts w:eastAsia="Arial"/>
-                <w:bCs/>
-                <w:sz w:val="22"/>
-                <w:szCs w:val="22"/>
-              </w:rPr>
-            </w:pPr>
           </w:p>
         </w:tc>
       </w:tr>
@@ -2990,7 +2963,7 @@
         </w:trPr>
         <w:tc>
           <w:tcPr>
-            <w:tcW w:w="2694" w:type="dxa"/>
+            <w:tcW w:w="2450" w:type="dxa"/>
             <w:shd w:val="clear" w:color="auto" w:fill="FFFFFF" w:themeFill="background1"/>
             <w:vAlign w:val="center"/>
           </w:tcPr>
@@ -3019,7 +2992,7 @@
         </w:tc>
         <w:tc>
           <w:tcPr>
-            <w:tcW w:w="6379" w:type="dxa"/>
+            <w:tcW w:w="4981" w:type="dxa"/>
           </w:tcPr>
           <w:p>
             <w:pPr>
@@ -3031,7 +3004,6 @@
                 <w:szCs w:val="22"/>
               </w:rPr>
             </w:pPr>
-            <w:proofErr w:type="gramStart"/>
             <w:r>
               <w:rPr>
                 <w:rFonts w:eastAsia="Arial"/>
@@ -3052,7 +3024,6 @@
               <w:t>extension</w:t>
             </w:r>
             <w:proofErr w:type="spellEnd"/>
-            <w:proofErr w:type="gramEnd"/>
             <w:r>
               <w:rPr>
                 <w:rFonts w:eastAsia="Arial"/>
@@ -3066,9 +3037,148 @@
         </w:tc>
         <w:tc>
           <w:tcPr>
-            <w:tcW w:w="1275" w:type="dxa"/>
+            <w:tcW w:w="2917" w:type="dxa"/>
             <w:vAlign w:val="center"/>
           </w:tcPr>
+          <w:p>
+            <w:pPr>
+              <w:jc w:val="center"/>
+              <w:rPr>
+                <w:rFonts w:eastAsia="Arial"/>
+                <w:bCs/>
+                <w:sz w:val="22"/>
+                <w:szCs w:val="22"/>
+              </w:rPr>
+            </w:pPr>
+            <w:r>
+              <w:rPr>
+                <w:rFonts w:eastAsia="Arial"/>
+                <w:bCs/>
+                <w:sz w:val="22"/>
+                <w:szCs w:val="22"/>
+              </w:rPr>
+              <w:t xml:space="preserve">{{ </w:t>
+            </w:r>
+            <w:proofErr w:type="spellStart"/>
+            <w:r>
+              <w:rPr>
+                <w:rFonts w:eastAsia="Arial"/>
+                <w:bCs/>
+                <w:sz w:val="22"/>
+                <w:szCs w:val="22"/>
+              </w:rPr>
+              <w:t>tiempo_</w:t>
+            </w:r>
+            <w:r>
+              <w:rPr>
+                <w:rFonts w:eastAsia="Arial"/>
+                <w:bCs/>
+                <w:sz w:val="22"/>
+                <w:szCs w:val="22"/>
+              </w:rPr>
+              <w:t>extension</w:t>
+            </w:r>
+            <w:proofErr w:type="spellEnd"/>
+            <w:r>
+              <w:rPr>
+                <w:rFonts w:eastAsia="Arial"/>
+                <w:bCs/>
+                <w:sz w:val="22"/>
+                <w:szCs w:val="22"/>
+              </w:rPr>
+              <w:t xml:space="preserve"> }}</w:t>
+            </w:r>
+          </w:p>
+        </w:tc>
+      </w:tr>
+      <w:tr>
+        <w:trPr>
+          <w:trHeight w:val="448"/>
+        </w:trPr>
+        <w:tc>
+          <w:tcPr>
+            <w:tcW w:w="2450" w:type="dxa"/>
+            <w:shd w:val="clear" w:color="auto" w:fill="FFFFFF" w:themeFill="background1"/>
+            <w:vAlign w:val="center"/>
+          </w:tcPr>
+          <w:p>
+            <w:pPr>
+              <w:jc w:val="center"/>
+              <w:rPr>
+                <w:rFonts w:eastAsia="Arial"/>
+                <w:b/>
+                <w:bCs/>
+                <w:sz w:val="22"/>
+                <w:szCs w:val="22"/>
+              </w:rPr>
+            </w:pPr>
+          </w:p>
+        </w:tc>
+        <w:tc>
+          <w:tcPr>
+            <w:tcW w:w="4981" w:type="dxa"/>
+          </w:tcPr>
+          <w:p>
+            <w:pPr>
+              <w:jc w:val="both"/>
+              <w:rPr>
+                <w:rFonts w:eastAsia="Arial"/>
+                <w:bCs/>
+                <w:sz w:val="22"/>
+                <w:szCs w:val="22"/>
+              </w:rPr>
+            </w:pPr>
+          </w:p>
+        </w:tc>
+        <w:tc>
+          <w:tcPr>
+            <w:tcW w:w="2917" w:type="dxa"/>
+            <w:vAlign w:val="center"/>
+          </w:tcPr>
+          <w:p>
+            <w:pPr>
+              <w:jc w:val="center"/>
+              <w:rPr>
+                <w:rFonts w:eastAsia="Arial"/>
+                <w:sz w:val="22"/>
+                <w:szCs w:val="22"/>
+              </w:rPr>
+            </w:pPr>
+            <w:r>
+              <w:rPr>
+                <w:rFonts w:eastAsia="Arial"/>
+                <w:sz w:val="22"/>
+                <w:szCs w:val="22"/>
+              </w:rPr>
+              <w:t xml:space="preserve">{{ </w:t>
+            </w:r>
+            <w:proofErr w:type="spellStart"/>
+            <w:r>
+              <w:rPr>
+                <w:rFonts w:eastAsia="Arial"/>
+                <w:sz w:val="22"/>
+                <w:szCs w:val="22"/>
+              </w:rPr>
+              <w:t>duracion</w:t>
+            </w:r>
+            <w:r>
+              <w:rPr>
+                <w:rFonts w:eastAsia="Arial"/>
+                <w:sz w:val="22"/>
+                <w:szCs w:val="22"/>
+              </w:rPr>
+              <w:t>_total</w:t>
+            </w:r>
+            <w:proofErr w:type="spellEnd"/>
+            <w:r>
+              <w:rPr>
+                <w:rFonts w:eastAsia="Arial"/>
+                <w:sz w:val="22"/>
+                <w:szCs w:val="22"/>
+              </w:rPr>
+              <w:t xml:space="preserve"> }}</w:t>
+            </w:r>
+          </w:p>
           <w:p>
             <w:pPr>
               <w:jc w:val="center"/>
@@ -3169,7 +3279,6 @@
                 <w:lang w:val="en-GB"/>
               </w:rPr>
             </w:pPr>
-            <w:proofErr w:type="gramStart"/>
             <w:r>
               <w:rPr>
                 <w:rFonts w:eastAsia="Arial"/>
@@ -3185,16 +3294,7 @@
                 <w:sz w:val="22"/>
                 <w:szCs w:val="22"/>
               </w:rPr>
-              <w:t>materiales</w:t>
-            </w:r>
-            <w:proofErr w:type="gramEnd"/>
-            <w:r>
-              <w:rPr>
-                <w:rFonts w:eastAsia="Arial"/>
-                <w:sz w:val="22"/>
-                <w:szCs w:val="22"/>
-              </w:rPr>
-              <w:t>_recursos</w:t>
+              <w:t>materiales_recursos</w:t>
             </w:r>
             <w:proofErr w:type="spellEnd"/>
             <w:r>
@@ -3220,43 +3320,6 @@
           <w:lang w:val="en-GB"/>
         </w:rPr>
       </w:pPr>
-    </w:p>
-    <w:p>
-      <w:pPr>
-        <w:rPr>
-          <w:rFonts w:eastAsia="Arial"/>
-          <w:sz w:val="22"/>
-          <w:szCs w:val="22"/>
-        </w:rPr>
-      </w:pPr>
-      <w:proofErr w:type="gramStart"/>
-      <w:r>
-        <w:rPr>
-          <w:rFonts w:eastAsia="Arial"/>
-          <w:sz w:val="22"/>
-          <w:szCs w:val="22"/>
-        </w:rPr>
-        <w:t xml:space="preserve">{{ </w:t>
-      </w:r>
-      <w:proofErr w:type="spellStart"/>
-      <w:r>
-        <w:rPr>
-          <w:rFonts w:eastAsia="Arial"/>
-          <w:sz w:val="22"/>
-          <w:szCs w:val="22"/>
-        </w:rPr>
-        <w:t>duracion</w:t>
-      </w:r>
-      <w:proofErr w:type="spellEnd"/>
-      <w:proofErr w:type="gramEnd"/>
-      <w:r>
-        <w:rPr>
-          <w:rFonts w:eastAsia="Arial"/>
-          <w:sz w:val="22"/>
-          <w:szCs w:val="22"/>
-        </w:rPr>
-        <w:t xml:space="preserve"> }}</w:t>
-      </w:r>
     </w:p>
     <w:p>
       <w:pPr>
@@ -3315,7 +3378,6 @@
           <w:szCs w:val="22"/>
         </w:rPr>
       </w:pPr>
-      <w:proofErr w:type="gramStart"/>
       <w:r>
         <w:rPr>
           <w:rFonts w:eastAsia="Arial"/>
@@ -3335,29 +3397,7 @@
           <w:sz w:val="22"/>
           <w:szCs w:val="22"/>
         </w:rPr>
-        <w:t>tipo</w:t>
-      </w:r>
-      <w:proofErr w:type="gramEnd"/>
-      <w:r>
-        <w:rPr>
-          <w:rFonts w:eastAsia="Arial"/>
-          <w:b/>
-          <w:bCs/>
-          <w:sz w:val="22"/>
-          <w:szCs w:val="22"/>
-        </w:rPr>
-        <w:t>_</w:t>
-      </w:r>
-      <w:proofErr w:type="gramStart"/>
-      <w:r>
-        <w:rPr>
-          <w:rFonts w:eastAsia="Arial"/>
-          <w:b/>
-          <w:bCs/>
-          <w:sz w:val="22"/>
-          <w:szCs w:val="22"/>
-        </w:rPr>
-        <w:t>rubrica</w:t>
+        <w:t>tipo_rubrica</w:t>
       </w:r>
       <w:proofErr w:type="spellEnd"/>
       <w:r>
@@ -3368,10 +3408,12 @@
           <w:sz w:val="22"/>
           <w:szCs w:val="22"/>
         </w:rPr>
-        <w:t xml:space="preserve"> }</w:t>
+        <w:t xml:space="preserve"> }}</w:t>
       </w:r>
-      <w:proofErr w:type="gramEnd"/>
-      <w:r>
+    </w:p>
+    <w:p>
+      <w:pPr>
+        <w:jc w:val="center"/>
         <w:rPr>
           <w:rFonts w:eastAsia="Arial"/>
           <w:b/>
@@ -3379,489 +3421,11 @@
           <w:sz w:val="22"/>
           <w:szCs w:val="22"/>
         </w:rPr>
-        <w:t>}</w:t>
-      </w:r>
+      </w:pPr>
     </w:p>
-    <w:tbl>
-      <w:tblPr>
-        <w:tblStyle w:val="TableGridLight"/>
-        <w:tblpPr w:leftFromText="141" w:rightFromText="141" w:vertAnchor="text" w:horzAnchor="page" w:tblpX="526" w:tblpY="82"/>
-        <w:tblW w:w="10933" w:type="dxa"/>
-        <w:tblLook w:val="04A0" w:firstRow="1" w:lastRow="0" w:firstColumn="1" w:lastColumn="0" w:noHBand="0" w:noVBand="1"/>
-      </w:tblPr>
-      <w:tblGrid>
-        <w:gridCol w:w="1980"/>
-        <w:gridCol w:w="2693"/>
-        <w:gridCol w:w="1985"/>
-        <w:gridCol w:w="2268"/>
-        <w:gridCol w:w="2007"/>
-      </w:tblGrid>
-      <w:tr>
-        <w:trPr>
-          <w:trHeight w:val="211"/>
-        </w:trPr>
-        <w:tc>
-          <w:tcPr>
-            <w:tcW w:w="1980" w:type="dxa"/>
-            <w:hideMark/>
-          </w:tcPr>
-          <w:p>
-            <w:pPr>
-              <w:jc w:val="center"/>
-              <w:rPr>
-                <w:rFonts w:eastAsia="Arial"/>
-                <w:b/>
-                <w:bCs/>
-                <w:sz w:val="22"/>
-                <w:szCs w:val="22"/>
-              </w:rPr>
-            </w:pPr>
-            <w:r>
-              <w:rPr>
-                <w:b/>
-                <w:bCs/>
-                <w:sz w:val="22"/>
-                <w:szCs w:val="22"/>
-              </w:rPr>
-              <w:t>Criterio de Evaluación</w:t>
-            </w:r>
-          </w:p>
-        </w:tc>
-        <w:tc>
-          <w:tcPr>
-            <w:tcW w:w="2693" w:type="dxa"/>
-            <w:hideMark/>
-          </w:tcPr>
-          <w:p>
-            <w:pPr>
-              <w:jc w:val="center"/>
-              <w:rPr>
-                <w:rFonts w:eastAsia="Arial"/>
-                <w:b/>
-                <w:bCs/>
-                <w:sz w:val="22"/>
-                <w:szCs w:val="22"/>
-              </w:rPr>
-            </w:pPr>
-            <w:r>
-              <w:rPr>
-                <w:b/>
-                <w:bCs/>
-                <w:sz w:val="22"/>
-                <w:szCs w:val="22"/>
-              </w:rPr>
-              <w:t>Logro Destacado</w:t>
-            </w:r>
-          </w:p>
-        </w:tc>
-        <w:tc>
-          <w:tcPr>
-            <w:tcW w:w="1985" w:type="dxa"/>
-            <w:hideMark/>
-          </w:tcPr>
-          <w:p>
-            <w:pPr>
-              <w:jc w:val="center"/>
-              <w:rPr>
-                <w:rFonts w:eastAsia="Arial"/>
-                <w:b/>
-                <w:bCs/>
-                <w:sz w:val="22"/>
-                <w:szCs w:val="22"/>
-              </w:rPr>
-            </w:pPr>
-            <w:r>
-              <w:rPr>
-                <w:b/>
-                <w:bCs/>
-                <w:sz w:val="22"/>
-                <w:szCs w:val="22"/>
-              </w:rPr>
-              <w:t>Logr</w:t>
-            </w:r>
-            <w:r>
-              <w:rPr>
-                <w:b/>
-                <w:bCs/>
-                <w:sz w:val="22"/>
-                <w:szCs w:val="22"/>
-              </w:rPr>
-              <w:t>o Esperado</w:t>
-            </w:r>
-          </w:p>
-        </w:tc>
-        <w:tc>
-          <w:tcPr>
-            <w:tcW w:w="2268" w:type="dxa"/>
-            <w:hideMark/>
-          </w:tcPr>
-          <w:p>
-            <w:pPr>
-              <w:jc w:val="center"/>
-              <w:rPr>
-                <w:rFonts w:eastAsia="Arial"/>
-                <w:b/>
-                <w:bCs/>
-                <w:sz w:val="22"/>
-                <w:szCs w:val="22"/>
-              </w:rPr>
-            </w:pPr>
-            <w:r>
-              <w:rPr>
-                <w:b/>
-                <w:bCs/>
-                <w:sz w:val="22"/>
-                <w:szCs w:val="22"/>
-              </w:rPr>
-              <w:t>En Proceso</w:t>
-            </w:r>
-          </w:p>
-        </w:tc>
-        <w:tc>
-          <w:tcPr>
-            <w:tcW w:w="2007" w:type="dxa"/>
-          </w:tcPr>
-          <w:p>
-            <w:pPr>
-              <w:jc w:val="center"/>
-              <w:rPr>
-                <w:rFonts w:eastAsia="Arial"/>
-                <w:b/>
-                <w:bCs/>
-                <w:sz w:val="22"/>
-                <w:szCs w:val="22"/>
-              </w:rPr>
-            </w:pPr>
-            <w:r>
-              <w:rPr>
-                <w:b/>
-                <w:bCs/>
-                <w:sz w:val="22"/>
-                <w:szCs w:val="22"/>
-              </w:rPr>
-              <w:t>En Inicio</w:t>
-            </w:r>
-          </w:p>
-        </w:tc>
-      </w:tr>
-      <w:tr>
-        <w:trPr>
-          <w:trHeight w:val="942"/>
-        </w:trPr>
-        <w:tc>
-          <w:tcPr>
-            <w:tcW w:w="1980" w:type="dxa"/>
-          </w:tcPr>
-          <w:p>
-            <w:pPr>
-              <w:jc w:val="center"/>
-              <w:rPr>
-                <w:rFonts w:eastAsia="Arial"/>
-                <w:sz w:val="22"/>
-                <w:szCs w:val="22"/>
-              </w:rPr>
-            </w:pPr>
-          </w:p>
-        </w:tc>
-        <w:tc>
-          <w:tcPr>
-            <w:tcW w:w="2693" w:type="dxa"/>
-          </w:tcPr>
-          <w:p>
-            <w:pPr>
-              <w:jc w:val="center"/>
-              <w:rPr>
-                <w:rFonts w:eastAsia="Arial"/>
-                <w:sz w:val="22"/>
-                <w:szCs w:val="22"/>
-              </w:rPr>
-            </w:pPr>
-          </w:p>
-        </w:tc>
-        <w:tc>
-          <w:tcPr>
-            <w:tcW w:w="1985" w:type="dxa"/>
-          </w:tcPr>
-          <w:p>
-            <w:pPr>
-              <w:jc w:val="center"/>
-              <w:rPr>
-                <w:rFonts w:eastAsia="Arial"/>
-                <w:sz w:val="22"/>
-                <w:szCs w:val="22"/>
-              </w:rPr>
-            </w:pPr>
-          </w:p>
-        </w:tc>
-        <w:tc>
-          <w:tcPr>
-            <w:tcW w:w="2268" w:type="dxa"/>
-          </w:tcPr>
-          <w:p>
-            <w:pPr>
-              <w:jc w:val="center"/>
-              <w:rPr>
-                <w:rFonts w:eastAsia="Arial"/>
-                <w:sz w:val="22"/>
-                <w:szCs w:val="22"/>
-              </w:rPr>
-            </w:pPr>
-          </w:p>
-        </w:tc>
-        <w:tc>
-          <w:tcPr>
-            <w:tcW w:w="2007" w:type="dxa"/>
-          </w:tcPr>
-          <w:p>
-            <w:pPr>
-              <w:jc w:val="center"/>
-              <w:rPr>
-                <w:sz w:val="22"/>
-                <w:szCs w:val="22"/>
-              </w:rPr>
-            </w:pPr>
-          </w:p>
-        </w:tc>
-      </w:tr>
-      <w:tr>
-        <w:trPr>
-          <w:trHeight w:val="844"/>
-        </w:trPr>
-        <w:tc>
-          <w:tcPr>
-            <w:tcW w:w="1980" w:type="dxa"/>
-          </w:tcPr>
-          <w:p>
-            <w:pPr>
-              <w:jc w:val="center"/>
-              <w:rPr>
-                <w:rFonts w:eastAsia="Arial"/>
-                <w:sz w:val="22"/>
-                <w:szCs w:val="22"/>
-              </w:rPr>
-            </w:pPr>
-          </w:p>
-        </w:tc>
-        <w:tc>
-          <w:tcPr>
-            <w:tcW w:w="2693" w:type="dxa"/>
-          </w:tcPr>
-          <w:p>
-            <w:pPr>
-              <w:jc w:val="center"/>
-              <w:rPr>
-                <w:rFonts w:eastAsia="Arial"/>
-                <w:sz w:val="22"/>
-                <w:szCs w:val="22"/>
-              </w:rPr>
-            </w:pPr>
-          </w:p>
-        </w:tc>
-        <w:tc>
-          <w:tcPr>
-            <w:tcW w:w="1985" w:type="dxa"/>
-          </w:tcPr>
-          <w:p>
-            <w:pPr>
-              <w:jc w:val="center"/>
-              <w:rPr>
-                <w:rFonts w:eastAsia="Arial"/>
-                <w:sz w:val="22"/>
-                <w:szCs w:val="22"/>
-              </w:rPr>
-            </w:pPr>
-          </w:p>
-        </w:tc>
-        <w:tc>
-          <w:tcPr>
-            <w:tcW w:w="2268" w:type="dxa"/>
-          </w:tcPr>
-          <w:p>
-            <w:pPr>
-              <w:jc w:val="center"/>
-              <w:rPr>
-                <w:rFonts w:eastAsia="Arial"/>
-                <w:sz w:val="22"/>
-                <w:szCs w:val="22"/>
-              </w:rPr>
-            </w:pPr>
-          </w:p>
-        </w:tc>
-        <w:tc>
-          <w:tcPr>
-            <w:tcW w:w="2007" w:type="dxa"/>
-          </w:tcPr>
-          <w:p>
-            <w:pPr>
-              <w:jc w:val="center"/>
-              <w:rPr>
-                <w:rFonts w:eastAsia="Arial"/>
-                <w:sz w:val="22"/>
-                <w:szCs w:val="22"/>
-              </w:rPr>
-            </w:pPr>
-          </w:p>
-        </w:tc>
-      </w:tr>
-      <w:tr>
-        <w:trPr>
-          <w:trHeight w:val="659"/>
-        </w:trPr>
-        <w:tc>
-          <w:tcPr>
-            <w:tcW w:w="1980" w:type="dxa"/>
-          </w:tcPr>
-          <w:p>
-            <w:pPr>
-              <w:jc w:val="center"/>
-              <w:rPr>
-                <w:rFonts w:eastAsia="Arial"/>
-                <w:sz w:val="22"/>
-                <w:szCs w:val="22"/>
-              </w:rPr>
-            </w:pPr>
-          </w:p>
-        </w:tc>
-        <w:tc>
-          <w:tcPr>
-            <w:tcW w:w="2693" w:type="dxa"/>
-          </w:tcPr>
-          <w:p>
-            <w:pPr>
-              <w:jc w:val="center"/>
-              <w:rPr>
-                <w:rFonts w:eastAsia="Arial"/>
-                <w:sz w:val="22"/>
-                <w:szCs w:val="22"/>
-              </w:rPr>
-            </w:pPr>
-          </w:p>
-        </w:tc>
-        <w:tc>
-          <w:tcPr>
-            <w:tcW w:w="1985" w:type="dxa"/>
-          </w:tcPr>
-          <w:p>
-            <w:pPr>
-              <w:jc w:val="center"/>
-              <w:rPr>
-                <w:rFonts w:eastAsia="Arial"/>
-                <w:sz w:val="22"/>
-                <w:szCs w:val="22"/>
-              </w:rPr>
-            </w:pPr>
-          </w:p>
-        </w:tc>
-        <w:tc>
-          <w:tcPr>
-            <w:tcW w:w="2268" w:type="dxa"/>
-          </w:tcPr>
-          <w:p>
-            <w:pPr>
-              <w:jc w:val="center"/>
-              <w:rPr>
-                <w:rFonts w:eastAsia="Arial"/>
-                <w:sz w:val="22"/>
-                <w:szCs w:val="22"/>
-              </w:rPr>
-            </w:pPr>
-          </w:p>
-        </w:tc>
-        <w:tc>
-          <w:tcPr>
-            <w:tcW w:w="2007" w:type="dxa"/>
-          </w:tcPr>
-          <w:p>
-            <w:pPr>
-              <w:jc w:val="center"/>
-              <w:rPr>
-                <w:rFonts w:eastAsia="Arial"/>
-                <w:sz w:val="22"/>
-                <w:szCs w:val="22"/>
-              </w:rPr>
-            </w:pPr>
-          </w:p>
-        </w:tc>
-      </w:tr>
-      <w:tr>
-        <w:trPr>
-          <w:trHeight w:val="811"/>
-        </w:trPr>
-        <w:tc>
-          <w:tcPr>
-            <w:tcW w:w="1980" w:type="dxa"/>
-          </w:tcPr>
-          <w:p>
-            <w:pPr>
-              <w:jc w:val="center"/>
-              <w:rPr>
-                <w:rFonts w:eastAsia="Arial"/>
-                <w:sz w:val="22"/>
-                <w:szCs w:val="22"/>
-              </w:rPr>
-            </w:pPr>
-          </w:p>
-        </w:tc>
-        <w:tc>
-          <w:tcPr>
-            <w:tcW w:w="2693" w:type="dxa"/>
-          </w:tcPr>
-          <w:p>
-            <w:pPr>
-              <w:jc w:val="center"/>
-              <w:rPr>
-                <w:sz w:val="22"/>
-                <w:szCs w:val="22"/>
-              </w:rPr>
-            </w:pPr>
-          </w:p>
-        </w:tc>
-        <w:tc>
-          <w:tcPr>
-            <w:tcW w:w="1985" w:type="dxa"/>
-          </w:tcPr>
-          <w:p>
-            <w:pPr>
-              <w:jc w:val="center"/>
-              <w:rPr>
-                <w:sz w:val="22"/>
-                <w:szCs w:val="22"/>
-              </w:rPr>
-            </w:pPr>
-          </w:p>
-        </w:tc>
-        <w:tc>
-          <w:tcPr>
-            <w:tcW w:w="2268" w:type="dxa"/>
-          </w:tcPr>
-          <w:p>
-            <w:pPr>
-              <w:jc w:val="center"/>
-              <w:rPr>
-                <w:sz w:val="22"/>
-                <w:szCs w:val="22"/>
-              </w:rPr>
-            </w:pPr>
-          </w:p>
-        </w:tc>
-        <w:tc>
-          <w:tcPr>
-            <w:tcW w:w="2007" w:type="dxa"/>
-          </w:tcPr>
-          <w:p>
-            <w:pPr>
-              <w:jc w:val="center"/>
-              <w:rPr>
-                <w:sz w:val="22"/>
-                <w:szCs w:val="22"/>
-              </w:rPr>
-            </w:pPr>
-          </w:p>
-        </w:tc>
-      </w:tr>
-    </w:tbl>
     <w:p>
       <w:pPr>
+        <w:jc w:val="center"/>
         <w:rPr>
           <w:rFonts w:eastAsia="Arial"/>
           <w:b/>
@@ -3871,6 +3435,649 @@
         </w:rPr>
       </w:pPr>
     </w:p>
+    <w:tbl>
+      <w:tblPr>
+        <w:tblStyle w:val="TableGrid"/>
+        <w:tblpPr w:leftFromText="141" w:rightFromText="141" w:vertAnchor="text" w:horzAnchor="page" w:tblpX="526" w:tblpY="82"/>
+        <w:tblW w:w="10933" w:type="dxa"/>
+        <w:tblLook w:val="04A0" w:firstRow="1" w:lastRow="0" w:firstColumn="1" w:lastColumn="0" w:noHBand="0" w:noVBand="1"/>
+      </w:tblPr>
+      <w:tblGrid>
+        <w:gridCol w:w="1911"/>
+        <w:gridCol w:w="2445"/>
+        <w:gridCol w:w="2343"/>
+        <w:gridCol w:w="2005"/>
+        <w:gridCol w:w="2229"/>
+      </w:tblGrid>
+      <w:tr>
+        <w:trPr>
+          <w:trHeight w:val="211"/>
+        </w:trPr>
+        <w:tc>
+          <w:tcPr>
+            <w:tcW w:w="1911" w:type="dxa"/>
+            <w:hideMark/>
+          </w:tcPr>
+          <w:p>
+            <w:pPr>
+              <w:jc w:val="center"/>
+              <w:rPr>
+                <w:rFonts w:eastAsia="Arial"/>
+                <w:b/>
+                <w:bCs/>
+                <w:sz w:val="22"/>
+                <w:szCs w:val="22"/>
+              </w:rPr>
+            </w:pPr>
+            <w:r>
+              <w:rPr>
+                <w:b/>
+                <w:bCs/>
+                <w:sz w:val="22"/>
+                <w:szCs w:val="22"/>
+              </w:rPr>
+              <w:t>Criterio de Evaluación</w:t>
+            </w:r>
+          </w:p>
+        </w:tc>
+        <w:tc>
+          <w:tcPr>
+            <w:tcW w:w="2445" w:type="dxa"/>
+            <w:hideMark/>
+          </w:tcPr>
+          <w:p>
+            <w:pPr>
+              <w:jc w:val="center"/>
+              <w:rPr>
+                <w:rFonts w:eastAsia="Arial"/>
+                <w:b/>
+                <w:bCs/>
+                <w:sz w:val="22"/>
+                <w:szCs w:val="22"/>
+              </w:rPr>
+            </w:pPr>
+            <w:r>
+              <w:rPr>
+                <w:b/>
+                <w:bCs/>
+                <w:sz w:val="22"/>
+                <w:szCs w:val="22"/>
+              </w:rPr>
+              <w:t>Logro Destacado</w:t>
+            </w:r>
+            <w:r>
+              <w:rPr>
+                <w:b/>
+                <w:bCs/>
+                <w:sz w:val="22"/>
+                <w:szCs w:val="22"/>
+              </w:rPr>
+              <w:t xml:space="preserve"> (AD)</w:t>
+            </w:r>
+          </w:p>
+        </w:tc>
+        <w:tc>
+          <w:tcPr>
+            <w:tcW w:w="2343" w:type="dxa"/>
+            <w:hideMark/>
+          </w:tcPr>
+          <w:p>
+            <w:pPr>
+              <w:jc w:val="center"/>
+              <w:rPr>
+                <w:rFonts w:eastAsia="Arial"/>
+                <w:b/>
+                <w:bCs/>
+                <w:sz w:val="22"/>
+                <w:szCs w:val="22"/>
+              </w:rPr>
+            </w:pPr>
+            <w:r>
+              <w:rPr>
+                <w:b/>
+                <w:bCs/>
+                <w:sz w:val="22"/>
+                <w:szCs w:val="22"/>
+              </w:rPr>
+              <w:t>Logr</w:t>
+            </w:r>
+            <w:r>
+              <w:rPr>
+                <w:b/>
+                <w:bCs/>
+                <w:sz w:val="22"/>
+                <w:szCs w:val="22"/>
+              </w:rPr>
+              <w:t>o Esperado</w:t>
+            </w:r>
+            <w:r>
+              <w:rPr>
+                <w:b/>
+                <w:bCs/>
+                <w:sz w:val="22"/>
+                <w:szCs w:val="22"/>
+              </w:rPr>
+              <w:t xml:space="preserve"> (A)</w:t>
+            </w:r>
+          </w:p>
+        </w:tc>
+        <w:tc>
+          <w:tcPr>
+            <w:tcW w:w="2005" w:type="dxa"/>
+            <w:hideMark/>
+          </w:tcPr>
+          <w:p>
+            <w:pPr>
+              <w:jc w:val="center"/>
+              <w:rPr>
+                <w:rFonts w:eastAsia="Arial"/>
+                <w:b/>
+                <w:bCs/>
+                <w:sz w:val="22"/>
+                <w:szCs w:val="22"/>
+              </w:rPr>
+            </w:pPr>
+            <w:r>
+              <w:rPr>
+                <w:b/>
+                <w:bCs/>
+                <w:sz w:val="22"/>
+                <w:szCs w:val="22"/>
+              </w:rPr>
+              <w:t>En Proceso</w:t>
+            </w:r>
+            <w:r>
+              <w:rPr>
+                <w:b/>
+                <w:bCs/>
+                <w:sz w:val="22"/>
+                <w:szCs w:val="22"/>
+              </w:rPr>
+              <w:t xml:space="preserve"> (B)</w:t>
+            </w:r>
+          </w:p>
+        </w:tc>
+        <w:tc>
+          <w:tcPr>
+            <w:tcW w:w="2229" w:type="dxa"/>
+          </w:tcPr>
+          <w:p>
+            <w:pPr>
+              <w:jc w:val="center"/>
+              <w:rPr>
+                <w:rFonts w:eastAsia="Arial"/>
+                <w:b/>
+                <w:bCs/>
+                <w:sz w:val="22"/>
+                <w:szCs w:val="22"/>
+              </w:rPr>
+            </w:pPr>
+            <w:r>
+              <w:rPr>
+                <w:b/>
+                <w:bCs/>
+                <w:sz w:val="22"/>
+                <w:szCs w:val="22"/>
+              </w:rPr>
+              <w:t>En Inicio</w:t>
+            </w:r>
+            <w:r>
+              <w:rPr>
+                <w:b/>
+                <w:bCs/>
+                <w:sz w:val="22"/>
+                <w:szCs w:val="22"/>
+              </w:rPr>
+              <w:t xml:space="preserve"> (C)</w:t>
+            </w:r>
+          </w:p>
+        </w:tc>
+      </w:tr>
+      <w:tr>
+        <w:trPr>
+          <w:trHeight w:val="844"/>
+        </w:trPr>
+        <w:tc>
+          <w:tcPr>
+            <w:tcW w:w="1911" w:type="dxa"/>
+          </w:tcPr>
+          <w:p>
+            <w:pPr>
+              <w:jc w:val="center"/>
+              <w:rPr>
+                <w:rFonts w:eastAsia="Arial"/>
+                <w:sz w:val="20"/>
+                <w:szCs w:val="20"/>
+                <w:lang w:val="en-GB"/>
+              </w:rPr>
+            </w:pPr>
+            <w:r>
+              <w:rPr>
+                <w:rFonts w:eastAsia="Arial"/>
+                <w:sz w:val="20"/>
+                <w:szCs w:val="20"/>
+                <w:lang w:val="en-GB"/>
+              </w:rPr>
+              <w:t xml:space="preserve">{%tr for fila in </w:t>
+            </w:r>
+            <w:proofErr w:type="spellStart"/>
+            <w:r>
+              <w:rPr>
+                <w:rFonts w:eastAsia="Arial"/>
+                <w:sz w:val="20"/>
+                <w:szCs w:val="20"/>
+                <w:lang w:val="en-GB"/>
+              </w:rPr>
+              <w:t>filas_rubrica</w:t>
+            </w:r>
+            <w:proofErr w:type="spellEnd"/>
+            <w:r>
+              <w:rPr>
+                <w:rFonts w:eastAsia="Arial"/>
+                <w:sz w:val="20"/>
+                <w:szCs w:val="20"/>
+                <w:lang w:val="en-GB"/>
+              </w:rPr>
+              <w:t xml:space="preserve"> %}</w:t>
+            </w:r>
+          </w:p>
+        </w:tc>
+        <w:tc>
+          <w:tcPr>
+            <w:tcW w:w="2445" w:type="dxa"/>
+          </w:tcPr>
+          <w:p>
+            <w:pPr>
+              <w:jc w:val="center"/>
+              <w:rPr>
+                <w:rFonts w:eastAsia="Arial"/>
+                <w:sz w:val="20"/>
+                <w:szCs w:val="20"/>
+                <w:lang w:val="en-GB"/>
+              </w:rPr>
+            </w:pPr>
+          </w:p>
+        </w:tc>
+        <w:tc>
+          <w:tcPr>
+            <w:tcW w:w="2343" w:type="dxa"/>
+          </w:tcPr>
+          <w:p>
+            <w:pPr>
+              <w:jc w:val="center"/>
+              <w:rPr>
+                <w:rFonts w:eastAsia="Arial"/>
+                <w:sz w:val="20"/>
+                <w:szCs w:val="20"/>
+                <w:lang w:val="en-GB"/>
+              </w:rPr>
+            </w:pPr>
+          </w:p>
+        </w:tc>
+        <w:tc>
+          <w:tcPr>
+            <w:tcW w:w="2005" w:type="dxa"/>
+          </w:tcPr>
+          <w:p>
+            <w:pPr>
+              <w:jc w:val="center"/>
+              <w:rPr>
+                <w:rFonts w:eastAsia="Arial"/>
+                <w:sz w:val="20"/>
+                <w:szCs w:val="20"/>
+                <w:lang w:val="en-GB"/>
+              </w:rPr>
+            </w:pPr>
+          </w:p>
+        </w:tc>
+        <w:tc>
+          <w:tcPr>
+            <w:tcW w:w="2229" w:type="dxa"/>
+          </w:tcPr>
+          <w:p>
+            <w:pPr>
+              <w:jc w:val="center"/>
+              <w:rPr>
+                <w:rFonts w:eastAsia="Arial"/>
+                <w:sz w:val="20"/>
+                <w:szCs w:val="20"/>
+              </w:rPr>
+            </w:pPr>
+          </w:p>
+        </w:tc>
+      </w:tr>
+      <w:tr>
+        <w:trPr>
+          <w:trHeight w:val="844"/>
+        </w:trPr>
+        <w:tc>
+          <w:tcPr>
+            <w:tcW w:w="1911" w:type="dxa"/>
+          </w:tcPr>
+          <w:p>
+            <w:pPr>
+              <w:jc w:val="center"/>
+              <w:rPr>
+                <w:rFonts w:eastAsia="Arial"/>
+                <w:sz w:val="20"/>
+                <w:szCs w:val="20"/>
+                <w:lang w:val="en-GB"/>
+              </w:rPr>
+            </w:pPr>
+            <w:r>
+              <w:rPr>
+                <w:rFonts w:eastAsia="Arial"/>
+                <w:sz w:val="20"/>
+                <w:szCs w:val="20"/>
+              </w:rPr>
+              <w:t xml:space="preserve">{{ </w:t>
+            </w:r>
+            <w:proofErr w:type="spellStart"/>
+            <w:r>
+              <w:rPr>
+                <w:rFonts w:eastAsia="Arial"/>
+                <w:sz w:val="20"/>
+                <w:szCs w:val="20"/>
+              </w:rPr>
+              <w:t>fila.criterio</w:t>
+            </w:r>
+            <w:proofErr w:type="spellEnd"/>
+            <w:r>
+              <w:rPr>
+                <w:rFonts w:eastAsia="Arial"/>
+                <w:sz w:val="20"/>
+                <w:szCs w:val="20"/>
+              </w:rPr>
+              <w:t xml:space="preserve"> }}</w:t>
+            </w:r>
+          </w:p>
+        </w:tc>
+        <w:tc>
+          <w:tcPr>
+            <w:tcW w:w="2445" w:type="dxa"/>
+          </w:tcPr>
+          <w:p>
+            <w:pPr>
+              <w:jc w:val="center"/>
+              <w:rPr>
+                <w:rFonts w:eastAsia="Arial"/>
+                <w:sz w:val="20"/>
+                <w:szCs w:val="20"/>
+                <w:lang w:val="en-GB"/>
+              </w:rPr>
+            </w:pPr>
+            <w:r>
+              <w:rPr>
+                <w:rFonts w:eastAsia="Arial"/>
+                <w:sz w:val="20"/>
+                <w:szCs w:val="20"/>
+                <w:lang w:val="en-GB"/>
+              </w:rPr>
+              <w:t xml:space="preserve">{{ </w:t>
+            </w:r>
+            <w:proofErr w:type="spellStart"/>
+            <w:r>
+              <w:rPr>
+                <w:rFonts w:eastAsia="Arial"/>
+                <w:sz w:val="20"/>
+                <w:szCs w:val="20"/>
+                <w:lang w:val="en-GB"/>
+              </w:rPr>
+              <w:t>fila.logro_destacado</w:t>
+            </w:r>
+            <w:proofErr w:type="spellEnd"/>
+            <w:r>
+              <w:rPr>
+                <w:rFonts w:eastAsia="Arial"/>
+                <w:sz w:val="20"/>
+                <w:szCs w:val="20"/>
+                <w:lang w:val="en-GB"/>
+              </w:rPr>
+              <w:t xml:space="preserve"> }}</w:t>
+            </w:r>
+          </w:p>
+        </w:tc>
+        <w:tc>
+          <w:tcPr>
+            <w:tcW w:w="2343" w:type="dxa"/>
+          </w:tcPr>
+          <w:p>
+            <w:pPr>
+              <w:jc w:val="center"/>
+              <w:rPr>
+                <w:rFonts w:eastAsia="Arial"/>
+                <w:sz w:val="20"/>
+                <w:szCs w:val="20"/>
+              </w:rPr>
+            </w:pPr>
+            <w:r>
+              <w:rPr>
+                <w:rFonts w:eastAsia="Arial"/>
+                <w:sz w:val="20"/>
+                <w:szCs w:val="20"/>
+              </w:rPr>
+              <w:t xml:space="preserve">{{ </w:t>
+            </w:r>
+            <w:proofErr w:type="spellStart"/>
+            <w:r>
+              <w:rPr>
+                <w:rFonts w:eastAsia="Arial"/>
+                <w:sz w:val="20"/>
+                <w:szCs w:val="20"/>
+              </w:rPr>
+              <w:t>fila.logro_esperado</w:t>
+            </w:r>
+            <w:proofErr w:type="spellEnd"/>
+            <w:r>
+              <w:rPr>
+                <w:rFonts w:eastAsia="Arial"/>
+                <w:sz w:val="20"/>
+                <w:szCs w:val="20"/>
+              </w:rPr>
+              <w:t xml:space="preserve"> }}</w:t>
+            </w:r>
+          </w:p>
+        </w:tc>
+        <w:tc>
+          <w:tcPr>
+            <w:tcW w:w="2005" w:type="dxa"/>
+          </w:tcPr>
+          <w:p>
+            <w:pPr>
+              <w:jc w:val="center"/>
+              <w:rPr>
+                <w:rFonts w:eastAsia="Arial"/>
+                <w:sz w:val="20"/>
+                <w:szCs w:val="20"/>
+              </w:rPr>
+            </w:pPr>
+            <w:r>
+              <w:rPr>
+                <w:rFonts w:eastAsia="Arial"/>
+                <w:sz w:val="20"/>
+                <w:szCs w:val="20"/>
+              </w:rPr>
+              <w:t xml:space="preserve">{{ </w:t>
+            </w:r>
+            <w:proofErr w:type="spellStart"/>
+            <w:r>
+              <w:rPr>
+                <w:rFonts w:eastAsia="Arial"/>
+                <w:sz w:val="20"/>
+                <w:szCs w:val="20"/>
+              </w:rPr>
+              <w:t>fila.en_proceso</w:t>
+            </w:r>
+            <w:proofErr w:type="spellEnd"/>
+            <w:r>
+              <w:rPr>
+                <w:rFonts w:eastAsia="Arial"/>
+                <w:sz w:val="20"/>
+                <w:szCs w:val="20"/>
+              </w:rPr>
+              <w:t xml:space="preserve"> }}</w:t>
+            </w:r>
+          </w:p>
+        </w:tc>
+        <w:tc>
+          <w:tcPr>
+            <w:tcW w:w="2229" w:type="dxa"/>
+          </w:tcPr>
+          <w:p>
+            <w:pPr>
+              <w:jc w:val="center"/>
+              <w:rPr>
+                <w:rFonts w:eastAsia="Arial"/>
+                <w:sz w:val="20"/>
+                <w:szCs w:val="20"/>
+              </w:rPr>
+            </w:pPr>
+            <w:r>
+              <w:rPr>
+                <w:rFonts w:eastAsia="Arial"/>
+                <w:sz w:val="20"/>
+                <w:szCs w:val="20"/>
+              </w:rPr>
+              <w:t xml:space="preserve">{{ </w:t>
+            </w:r>
+            <w:proofErr w:type="spellStart"/>
+            <w:r>
+              <w:rPr>
+                <w:rFonts w:eastAsia="Arial"/>
+                <w:sz w:val="20"/>
+                <w:szCs w:val="20"/>
+              </w:rPr>
+              <w:t>fila.en_inicio</w:t>
+            </w:r>
+            <w:proofErr w:type="spellEnd"/>
+            <w:r>
+              <w:rPr>
+                <w:rFonts w:eastAsia="Arial"/>
+                <w:sz w:val="20"/>
+                <w:szCs w:val="20"/>
+              </w:rPr>
+              <w:t xml:space="preserve"> }}</w:t>
+            </w:r>
+          </w:p>
+        </w:tc>
+      </w:tr>
+      <w:tr>
+        <w:trPr>
+          <w:trHeight w:val="844"/>
+        </w:trPr>
+        <w:tc>
+          <w:tcPr>
+            <w:tcW w:w="1911" w:type="dxa"/>
+          </w:tcPr>
+          <w:p>
+            <w:pPr>
+              <w:jc w:val="center"/>
+              <w:rPr>
+                <w:rFonts w:eastAsia="Arial"/>
+                <w:sz w:val="20"/>
+                <w:szCs w:val="20"/>
+              </w:rPr>
+            </w:pPr>
+            <w:r>
+              <w:rPr>
+                <w:rFonts w:eastAsia="Arial"/>
+                <w:sz w:val="20"/>
+                <w:szCs w:val="20"/>
+              </w:rPr>
+              <w:t>{%</w:t>
+            </w:r>
+            <w:proofErr w:type="spellStart"/>
+            <w:r>
+              <w:rPr>
+                <w:rFonts w:eastAsia="Arial"/>
+                <w:sz w:val="20"/>
+                <w:szCs w:val="20"/>
+              </w:rPr>
+              <w:t>tr</w:t>
+            </w:r>
+            <w:proofErr w:type="spellEnd"/>
+            <w:r>
+              <w:rPr>
+                <w:rFonts w:eastAsia="Arial"/>
+                <w:sz w:val="20"/>
+                <w:szCs w:val="20"/>
+              </w:rPr>
+              <w:t xml:space="preserve"> endfor %}</w:t>
+            </w:r>
+          </w:p>
+        </w:tc>
+        <w:tc>
+          <w:tcPr>
+            <w:tcW w:w="2445" w:type="dxa"/>
+          </w:tcPr>
+          <w:p>
+            <w:pPr>
+              <w:jc w:val="center"/>
+              <w:rPr>
+                <w:rFonts w:eastAsia="Arial"/>
+                <w:sz w:val="20"/>
+                <w:szCs w:val="20"/>
+                <w:lang w:val="en-GB"/>
+              </w:rPr>
+            </w:pPr>
+          </w:p>
+        </w:tc>
+        <w:tc>
+          <w:tcPr>
+            <w:tcW w:w="2343" w:type="dxa"/>
+          </w:tcPr>
+          <w:p>
+            <w:pPr>
+              <w:jc w:val="center"/>
+              <w:rPr>
+                <w:rFonts w:eastAsia="Arial"/>
+                <w:sz w:val="20"/>
+                <w:szCs w:val="20"/>
+              </w:rPr>
+            </w:pPr>
+          </w:p>
+        </w:tc>
+        <w:tc>
+          <w:tcPr>
+            <w:tcW w:w="2005" w:type="dxa"/>
+          </w:tcPr>
+          <w:p>
+            <w:pPr>
+              <w:jc w:val="center"/>
+              <w:rPr>
+                <w:rFonts w:eastAsia="Arial"/>
+                <w:sz w:val="20"/>
+                <w:szCs w:val="20"/>
+              </w:rPr>
+            </w:pPr>
+          </w:p>
+        </w:tc>
+        <w:tc>
+          <w:tcPr>
+            <w:tcW w:w="2229" w:type="dxa"/>
+          </w:tcPr>
+          <w:p>
+            <w:pPr>
+              <w:jc w:val="center"/>
+              <w:rPr>
+                <w:rFonts w:eastAsia="Arial"/>
+                <w:sz w:val="20"/>
+                <w:szCs w:val="20"/>
+              </w:rPr>
+            </w:pPr>
+          </w:p>
+        </w:tc>
+      </w:tr>
+    </w:tbl>
+    <w:p>
+      <w:pPr>
+        <w:rPr>
+          <w:rFonts w:eastAsia="Arial"/>
+          <w:sz w:val="22"/>
+          <w:szCs w:val="22"/>
+        </w:rPr>
+      </w:pPr>
+    </w:p>
     <w:p>
       <w:pPr>
         <w:jc w:val="center"/>
@@ -3880,24 +4087,6 @@
           <w:szCs w:val="22"/>
         </w:rPr>
       </w:pPr>
-      <w:proofErr w:type="gramStart"/>
-      <w:r>
-        <w:rPr>
-          <w:rFonts w:eastAsia="Arial"/>
-          <w:sz w:val="22"/>
-          <w:szCs w:val="22"/>
-        </w:rPr>
-        <w:t>{{ rubrica</w:t>
-      </w:r>
-      <w:proofErr w:type="gramEnd"/>
-      <w:r>
-        <w:rPr>
-          <w:rFonts w:eastAsia="Arial"/>
-          <w:sz w:val="22"/>
-          <w:szCs w:val="22"/>
-        </w:rPr>
-        <w:t xml:space="preserve"> }}</w:t>
-      </w:r>
     </w:p>
     <w:p>
       <w:pPr>
@@ -3921,6 +4110,17 @@
     </w:p>
     <w:p>
       <w:pPr>
+        <w:jc w:val="center"/>
+        <w:rPr>
+          <w:rFonts w:eastAsia="Arial"/>
+          <w:sz w:val="22"/>
+          <w:szCs w:val="22"/>
+        </w:rPr>
+      </w:pPr>
+    </w:p>
+    <w:p>
+      <w:pPr>
+        <w:jc w:val="center"/>
         <w:rPr>
           <w:rFonts w:eastAsia="Arial"/>
           <w:sz w:val="22"/>
@@ -4110,7 +4310,25 @@
                 <w:sz w:val="22"/>
                 <w:szCs w:val="22"/>
               </w:rPr>
-              <w:t>Nombre del Docente</w:t>
+              <w:t xml:space="preserve">{{ </w:t>
+            </w:r>
+            <w:proofErr w:type="spellStart"/>
+            <w:r>
+              <w:rPr>
+                <w:rFonts w:eastAsia="Script MT Bold"/>
+                <w:sz w:val="22"/>
+                <w:szCs w:val="22"/>
+              </w:rPr>
+              <w:t>nombre_docente</w:t>
+            </w:r>
+            <w:proofErr w:type="spellEnd"/>
+            <w:r>
+              <w:rPr>
+                <w:rFonts w:eastAsia="Script MT Bold"/>
+                <w:sz w:val="22"/>
+                <w:szCs w:val="22"/>
+              </w:rPr>
+              <w:t xml:space="preserve"> }}</w:t>
             </w:r>
           </w:p>
           <w:p>

</xml_diff>